<commit_message>
Update Requisitos - Atualizado - QTS.docx
</commit_message>
<xml_diff>
--- a/Documentação/Qualidade e Teste de Software/Requisitos/Requisitos - Atualizado - QTS.docx
+++ b/Documentação/Qualidade e Teste de Software/Requisitos/Requisitos - Atualizado - QTS.docx
@@ -1,6 +1,6 @@
 
 <file path=word/document.xml><?xml version="1.0" encoding="utf-8"?>
-<w:document xmlns:wpc="http://schemas.microsoft.com/office/word/2010/wordprocessingCanvas" xmlns:cx="http://schemas.microsoft.com/office/drawing/2014/chartex" xmlns:mc="http://schemas.openxmlformats.org/markup-compatibility/2006" xmlns:o="urn:schemas-microsoft-com:office:office" xmlns:r="http://schemas.openxmlformats.org/officeDocument/2006/relationships" xmlns:m="http://schemas.openxmlformats.org/officeDocument/2006/math" xmlns:v="urn:schemas-microsoft-com:vml" xmlns:wp14="http://schemas.microsoft.com/office/word/2010/wordprocessingDrawing" xmlns:wp="http://schemas.openxmlformats.org/drawingml/2006/wordprocessingDrawing" xmlns:w10="urn:schemas-microsoft-com:office:word" xmlns:w="http://schemas.openxmlformats.org/wordprocessingml/2006/main" xmlns:w14="http://schemas.microsoft.com/office/word/2010/wordml" xmlns:w15="http://schemas.microsoft.com/office/word/2012/wordml" xmlns:w16se="http://schemas.microsoft.com/office/word/2015/wordml/symex" xmlns:wpg="http://schemas.microsoft.com/office/word/2010/wordprocessingGroup" xmlns:wpi="http://schemas.microsoft.com/office/word/2010/wordprocessingInk" xmlns:wne="http://schemas.microsoft.com/office/word/2006/wordml" xmlns:wps="http://schemas.microsoft.com/office/word/2010/wordprocessingShape" mc:Ignorable="w14 w15 w16se wp14">
+<w:document xmlns:wpc="http://schemas.microsoft.com/office/word/2010/wordprocessingCanvas" xmlns:cx="http://schemas.microsoft.com/office/drawing/2014/chartex" xmlns:cx1="http://schemas.microsoft.com/office/drawing/2015/9/8/chartex" xmlns:cx2="http://schemas.microsoft.com/office/drawing/2015/10/21/chartex" xmlns:cx3="http://schemas.microsoft.com/office/drawing/2016/5/9/chartex" xmlns:cx4="http://schemas.microsoft.com/office/drawing/2016/5/10/chartex" xmlns:cx5="http://schemas.microsoft.com/office/drawing/2016/5/11/chartex" xmlns:cx6="http://schemas.microsoft.com/office/drawing/2016/5/12/chartex" xmlns:cx7="http://schemas.microsoft.com/office/drawing/2016/5/13/chartex" xmlns:cx8="http://schemas.microsoft.com/office/drawing/2016/5/14/chartex" xmlns:mc="http://schemas.openxmlformats.org/markup-compatibility/2006" xmlns:aink="http://schemas.microsoft.com/office/drawing/2016/ink" xmlns:am3d="http://schemas.microsoft.com/office/drawing/2017/model3d" xmlns:o="urn:schemas-microsoft-com:office:office" xmlns:oel="http://schemas.microsoft.com/office/2019/extlst" xmlns:r="http://schemas.openxmlformats.org/officeDocument/2006/relationships" xmlns:m="http://schemas.openxmlformats.org/officeDocument/2006/math" xmlns:v="urn:schemas-microsoft-com:vml" xmlns:wp14="http://schemas.microsoft.com/office/word/2010/wordprocessingDrawing" xmlns:wp="http://schemas.openxmlformats.org/drawingml/2006/wordprocessingDrawing" xmlns:w10="urn:schemas-microsoft-com:office:word" xmlns:w="http://schemas.openxmlformats.org/wordprocessingml/2006/main" xmlns:w14="http://schemas.microsoft.com/office/word/2010/wordml" xmlns:w15="http://schemas.microsoft.com/office/word/2012/wordml" xmlns:w16cex="http://schemas.microsoft.com/office/word/2018/wordml/cex" xmlns:w16cid="http://schemas.microsoft.com/office/word/2016/wordml/cid" xmlns:w16="http://schemas.microsoft.com/office/word/2018/wordml" xmlns:w16du="http://schemas.microsoft.com/office/word/2023/wordml/word16du" xmlns:w16sdtdh="http://schemas.microsoft.com/office/word/2020/wordml/sdtdatahash" xmlns:w16sdtfl="http://schemas.microsoft.com/office/word/2024/wordml/sdtformatlock" xmlns:w16se="http://schemas.microsoft.com/office/word/2015/wordml/symex" xmlns:wpg="http://schemas.microsoft.com/office/word/2010/wordprocessingGroup" xmlns:wpi="http://schemas.microsoft.com/office/word/2010/wordprocessingInk" xmlns:wne="http://schemas.microsoft.com/office/word/2006/wordml" xmlns:wps="http://schemas.microsoft.com/office/word/2010/wordprocessingShape" mc:Ignorable="w14 w15 w16se w16cid w16 w16cex w16sdtdh w16sdtfl w16du wp14">
   <w:body>
     <w:p>
       <w:pPr>
@@ -607,21 +607,7 @@
         <w:rPr>
           <w:szCs w:val="24"/>
         </w:rPr>
-        <w:t xml:space="preserve"> Escola Técnica Estadual </w:t>
-      </w:r>
-      <w:proofErr w:type="spellStart"/>
-      <w:r>
-        <w:rPr>
-          <w:szCs w:val="24"/>
-        </w:rPr>
-        <w:t>Ilza</w:t>
-      </w:r>
-      <w:proofErr w:type="spellEnd"/>
-      <w:r>
-        <w:rPr>
-          <w:szCs w:val="24"/>
-        </w:rPr>
-        <w:t xml:space="preserve"> Nascimento </w:t>
+        <w:t xml:space="preserve"> Escola Técnica Estadual Ilza Nascimento </w:t>
       </w:r>
       <w:proofErr w:type="spellStart"/>
       <w:r>
@@ -846,16 +832,8 @@
               <w:rPr>
                 <w:szCs w:val="24"/>
               </w:rPr>
-              <w:t xml:space="preserve">Efetuar </w:t>
-            </w:r>
-            <w:proofErr w:type="spellStart"/>
-            <w:r>
-              <w:rPr>
-                <w:szCs w:val="24"/>
-              </w:rPr>
-              <w:t>Login</w:t>
-            </w:r>
-            <w:proofErr w:type="spellEnd"/>
+              <w:t>Efetuar Login</w:t>
+            </w:r>
           </w:p>
         </w:tc>
       </w:tr>
@@ -1404,21 +1382,7 @@
               <w:rPr>
                 <w:szCs w:val="24"/>
               </w:rPr>
-              <w:t xml:space="preserve">O registro deve registrar cada </w:t>
-            </w:r>
-            <w:proofErr w:type="spellStart"/>
-            <w:r>
-              <w:rPr>
-                <w:szCs w:val="24"/>
-              </w:rPr>
-              <w:t>login</w:t>
-            </w:r>
-            <w:proofErr w:type="spellEnd"/>
-            <w:r>
-              <w:rPr>
-                <w:szCs w:val="24"/>
-              </w:rPr>
-              <w:t xml:space="preserve"> no log de auditoria, com identificação do usuário e data/hora</w:t>
+              <w:t>O sistema deve registrar cada login no log de auditoria, com identificação do usuário e data/hora</w:t>
             </w:r>
           </w:p>
         </w:tc>
@@ -1646,15 +1610,7 @@
               </w:rPr>
             </w:pPr>
             <w:r>
-              <w:t xml:space="preserve">O usuário é registrado no banco de dados e pode fazer </w:t>
-            </w:r>
-            <w:proofErr w:type="spellStart"/>
-            <w:r>
-              <w:t>login</w:t>
-            </w:r>
-            <w:proofErr w:type="spellEnd"/>
-            <w:r>
-              <w:t xml:space="preserve"> para acessar o sistema.</w:t>
+              <w:t>O usuário é registrado no banco de dados e pode fazer login para acessar o sistema.</w:t>
             </w:r>
           </w:p>
         </w:tc>
@@ -2026,7 +1982,7 @@
       <w:tr>
         <w:tc>
           <w:tcPr>
-            <w:tcW w:w="1299" w:type="dxa"/>
+            <w:tcW w:w="1364" w:type="dxa"/>
           </w:tcPr>
           <w:p>
             <w:pPr>
@@ -2077,7 +2033,7 @@
       <w:tr>
         <w:tc>
           <w:tcPr>
-            <w:tcW w:w="1299" w:type="dxa"/>
+            <w:tcW w:w="1364" w:type="dxa"/>
           </w:tcPr>
           <w:p>
             <w:pPr>
@@ -2122,7 +2078,7 @@
       <w:tr>
         <w:tc>
           <w:tcPr>
-            <w:tcW w:w="1838" w:type="dxa"/>
+            <w:tcW w:w="1903" w:type="dxa"/>
             <w:gridSpan w:val="3"/>
           </w:tcPr>
           <w:p>
@@ -2168,7 +2124,7 @@
       <w:tr>
         <w:tc>
           <w:tcPr>
-            <w:tcW w:w="1696" w:type="dxa"/>
+            <w:tcW w:w="1761" w:type="dxa"/>
             <w:gridSpan w:val="2"/>
           </w:tcPr>
           <w:p>
@@ -2220,7 +2176,7 @@
       <w:tr>
         <w:tc>
           <w:tcPr>
-            <w:tcW w:w="8696" w:type="dxa"/>
+            <w:tcW w:w="8761" w:type="dxa"/>
             <w:gridSpan w:val="6"/>
           </w:tcPr>
           <w:p>
@@ -2247,7 +2203,7 @@
       <w:tr>
         <w:tc>
           <w:tcPr>
-            <w:tcW w:w="2901" w:type="dxa"/>
+            <w:tcW w:w="2966" w:type="dxa"/>
             <w:gridSpan w:val="4"/>
           </w:tcPr>
           <w:p>
@@ -2332,7 +2288,7 @@
       <w:tr>
         <w:tc>
           <w:tcPr>
-            <w:tcW w:w="2901" w:type="dxa"/>
+            <w:tcW w:w="2966" w:type="dxa"/>
             <w:gridSpan w:val="4"/>
           </w:tcPr>
           <w:p>
@@ -2404,7 +2360,7 @@
       <w:tr>
         <w:tc>
           <w:tcPr>
-            <w:tcW w:w="2901" w:type="dxa"/>
+            <w:tcW w:w="2966" w:type="dxa"/>
             <w:gridSpan w:val="4"/>
           </w:tcPr>
           <w:p>
@@ -2467,7 +2423,109 @@
           </w:p>
         </w:tc>
       </w:tr>
+      <w:tr>
+        <w:tc>
+          <w:tcPr>
+            <w:tcW w:w="2966" w:type="dxa"/>
+            <w:gridSpan w:val="4"/>
+          </w:tcPr>
+          <w:p>
+            <w:pPr>
+              <w:spacing w:line="360" w:lineRule="auto"/>
+              <w:rPr>
+                <w:szCs w:val="24"/>
+              </w:rPr>
+            </w:pPr>
+            <w:r>
+              <w:rPr>
+                <w:szCs w:val="24"/>
+              </w:rPr>
+              <w:t>NF3.</w:t>
+            </w:r>
+            <w:r>
+              <w:rPr>
+                <w:szCs w:val="24"/>
+              </w:rPr>
+              <w:t>3</w:t>
+            </w:r>
+            <w:r>
+              <w:rPr>
+                <w:szCs w:val="24"/>
+              </w:rPr>
+              <w:t xml:space="preserve"> </w:t>
+            </w:r>
+            <w:r>
+              <w:rPr>
+                <w:szCs w:val="24"/>
+              </w:rPr>
+              <w:t>Unicidade CA + tamanho</w:t>
+            </w:r>
+          </w:p>
+        </w:tc>
+        <w:tc>
+          <w:tcPr>
+            <w:tcW w:w="3254" w:type="dxa"/>
+          </w:tcPr>
+          <w:p>
+            <w:pPr>
+              <w:spacing w:line="360" w:lineRule="auto"/>
+              <w:rPr>
+                <w:szCs w:val="24"/>
+              </w:rPr>
+            </w:pPr>
+            <w:r>
+              <w:rPr>
+                <w:szCs w:val="24"/>
+              </w:rPr>
+              <w:t>O sistema não deve permitir o cadastro de um EPI com CA e tamanho iguais aos de outro EPI da mesma empresa.</w:t>
+            </w:r>
+          </w:p>
+        </w:tc>
+        <w:tc>
+          <w:tcPr>
+            <w:tcW w:w="2541" w:type="dxa"/>
+          </w:tcPr>
+          <w:p>
+            <w:pPr>
+              <w:spacing w:line="360" w:lineRule="auto"/>
+              <w:rPr>
+                <w:szCs w:val="24"/>
+              </w:rPr>
+            </w:pPr>
+            <w:r>
+              <w:rPr>
+                <w:szCs w:val="24"/>
+              </w:rPr>
+              <w:t>Segurança</w:t>
+            </w:r>
+          </w:p>
+        </w:tc>
+      </w:tr>
     </w:tbl>
+    <w:p>
+      <w:pPr>
+        <w:spacing w:line="360" w:lineRule="auto"/>
+        <w:rPr>
+          <w:szCs w:val="24"/>
+        </w:rPr>
+      </w:pPr>
+    </w:p>
+    <w:p>
+      <w:pPr>
+        <w:spacing w:line="360" w:lineRule="auto"/>
+        <w:rPr>
+          <w:szCs w:val="24"/>
+        </w:rPr>
+      </w:pPr>
+    </w:p>
+    <w:p>
+      <w:pPr>
+        <w:spacing w:line="360" w:lineRule="auto"/>
+        <w:rPr>
+          <w:szCs w:val="24"/>
+        </w:rPr>
+      </w:pPr>
+    </w:p>
     <w:p>
       <w:pPr>
         <w:spacing w:line="360" w:lineRule="auto"/>
@@ -2686,7 +2744,7 @@
               <w:rPr>
                 <w:szCs w:val="24"/>
               </w:rPr>
-              <w:t>O sistema atualiza o estoque e registra a devolução no histórico</w:t>
+              <w:t>O sistema atualiza o estoque e registra a entrega no histórico</w:t>
             </w:r>
           </w:p>
         </w:tc>
@@ -2741,7 +2799,6 @@
                 <w:bCs/>
                 <w:szCs w:val="24"/>
               </w:rPr>
-              <w:lastRenderedPageBreak/>
               <w:t>Cód</w:t>
             </w:r>
             <w:proofErr w:type="spellEnd"/>
@@ -3751,7 +3808,6 @@
                 <w:bCs/>
                 <w:szCs w:val="24"/>
               </w:rPr>
-              <w:lastRenderedPageBreak/>
               <w:t>Cód</w:t>
             </w:r>
             <w:proofErr w:type="spellEnd"/>
@@ -4117,7 +4173,7 @@
               <w:rPr>
                 <w:szCs w:val="24"/>
               </w:rPr>
-              <w:t>Usuário gera relatórios sobre estoque, entregas e histórico de EPIs</w:t>
+              <w:t>Usuário gera e exporta o histórico de movimentações de EPIs em PDF</w:t>
             </w:r>
           </w:p>
         </w:tc>
@@ -4378,8 +4434,6 @@
               </w:rPr>
               <w:t>o histórico de movimentações</w:t>
             </w:r>
-            <w:bookmarkStart w:id="0" w:name="_GoBack"/>
-            <w:bookmarkEnd w:id="0"/>
             <w:r>
               <w:rPr>
                 <w:szCs w:val="24"/>
@@ -4540,7 +4594,6 @@
                 <w:bCs/>
                 <w:szCs w:val="24"/>
               </w:rPr>
-              <w:lastRenderedPageBreak/>
               <w:t>F8</w:t>
             </w:r>
           </w:p>
@@ -5096,7 +5149,7 @@
       <w:tr>
         <w:tc>
           <w:tcPr>
-            <w:tcW w:w="1299" w:type="dxa"/>
+            <w:tcW w:w="1364" w:type="dxa"/>
           </w:tcPr>
           <w:p>
             <w:pPr>
@@ -5141,23 +5194,24 @@
       <w:tr>
         <w:tc>
           <w:tcPr>
-            <w:tcW w:w="1299" w:type="dxa"/>
-          </w:tcPr>
-          <w:p>
-            <w:pPr>
-              <w:spacing w:line="360" w:lineRule="auto"/>
-              <w:rPr>
-                <w:b/>
-                <w:bCs/>
-                <w:szCs w:val="24"/>
-              </w:rPr>
-            </w:pPr>
-            <w:r>
-              <w:rPr>
-                <w:b/>
-                <w:bCs/>
-                <w:szCs w:val="24"/>
-              </w:rPr>
+            <w:tcW w:w="1364" w:type="dxa"/>
+          </w:tcPr>
+          <w:p>
+            <w:pPr>
+              <w:spacing w:line="360" w:lineRule="auto"/>
+              <w:rPr>
+                <w:b/>
+                <w:bCs/>
+                <w:szCs w:val="24"/>
+              </w:rPr>
+            </w:pPr>
+            <w:r>
+              <w:rPr>
+                <w:b/>
+                <w:bCs/>
+                <w:szCs w:val="24"/>
+              </w:rPr>
+              <w:lastRenderedPageBreak/>
               <w:t>Descrição</w:t>
             </w:r>
           </w:p>
@@ -5175,15 +5229,15 @@
               </w:rPr>
             </w:pPr>
             <w:r>
-              <w:t>Administrador adiciona e remove setores da empresa no sistema</w:t>
-            </w:r>
-          </w:p>
-        </w:tc>
-      </w:tr>
-      <w:tr>
-        <w:tc>
-          <w:tcPr>
-            <w:tcW w:w="1838" w:type="dxa"/>
+              <w:t>Administrador adiciona, edita (renomeia) e remove setores da empresa no sistema</w:t>
+            </w:r>
+          </w:p>
+        </w:tc>
+      </w:tr>
+      <w:tr>
+        <w:tc>
+          <w:tcPr>
+            <w:tcW w:w="1903" w:type="dxa"/>
             <w:gridSpan w:val="2"/>
           </w:tcPr>
           <w:p>
@@ -5218,23 +5272,15 @@
               </w:rPr>
             </w:pPr>
             <w:r>
-              <w:t xml:space="preserve">O administrador deve estar autenticado e </w:t>
-            </w:r>
-            <w:proofErr w:type="spellStart"/>
-            <w:r>
-              <w:t>com</w:t>
-            </w:r>
-            <w:proofErr w:type="spellEnd"/>
-            <w:r>
-              <w:t xml:space="preserve"> empresa cadastrada</w:t>
-            </w:r>
-          </w:p>
-        </w:tc>
-      </w:tr>
-      <w:tr>
-        <w:tc>
-          <w:tcPr>
-            <w:tcW w:w="1838" w:type="dxa"/>
+              <w:t>O administrador deve estar autenticado e com empresa cadastrada</w:t>
+            </w:r>
+          </w:p>
+        </w:tc>
+      </w:tr>
+      <w:tr>
+        <w:tc>
+          <w:tcPr>
+            <w:tcW w:w="1903" w:type="dxa"/>
             <w:gridSpan w:val="2"/>
           </w:tcPr>
           <w:p>
@@ -5277,7 +5323,7 @@
       <w:tr>
         <w:tc>
           <w:tcPr>
-            <w:tcW w:w="8696" w:type="dxa"/>
+            <w:tcW w:w="8761" w:type="dxa"/>
             <w:gridSpan w:val="5"/>
           </w:tcPr>
           <w:p>
@@ -5304,7 +5350,7 @@
       <w:tr>
         <w:tc>
           <w:tcPr>
-            <w:tcW w:w="2901" w:type="dxa"/>
+            <w:tcW w:w="2966" w:type="dxa"/>
             <w:gridSpan w:val="3"/>
           </w:tcPr>
           <w:p>
@@ -5389,7 +5435,7 @@
       <w:tr>
         <w:tc>
           <w:tcPr>
-            <w:tcW w:w="2901" w:type="dxa"/>
+            <w:tcW w:w="2966" w:type="dxa"/>
             <w:gridSpan w:val="3"/>
           </w:tcPr>
           <w:p>
@@ -5439,12 +5485,7 @@
               </w:rPr>
             </w:pPr>
             <w:r>
-              <w:lastRenderedPageBreak/>
-              <w:t xml:space="preserve">O sistema não deve permitir cadastro de setor com </w:t>
-            </w:r>
-            <w:r>
-              <w:lastRenderedPageBreak/>
-              <w:t>nome já existente na empresa.</w:t>
+              <w:t>O sistema não deve permitir cadastro de setor com nome já existente na empresa.</w:t>
             </w:r>
           </w:p>
         </w:tc>
@@ -5463,7 +5504,6 @@
               <w:rPr>
                 <w:szCs w:val="24"/>
               </w:rPr>
-              <w:lastRenderedPageBreak/>
               <w:t>Produto</w:t>
             </w:r>
           </w:p>
@@ -5472,7 +5512,7 @@
       <w:tr>
         <w:tc>
           <w:tcPr>
-            <w:tcW w:w="2901" w:type="dxa"/>
+            <w:tcW w:w="2966" w:type="dxa"/>
             <w:gridSpan w:val="3"/>
           </w:tcPr>
           <w:p>
@@ -5486,7 +5526,6 @@
               <w:rPr>
                 <w:szCs w:val="24"/>
               </w:rPr>
-              <w:lastRenderedPageBreak/>
               <w:t>NF9.2 Restrição de Exclusão</w:t>
             </w:r>
           </w:p>
@@ -5531,6 +5570,92 @@
                 <w:szCs w:val="24"/>
               </w:rPr>
               <w:t>Confiabilidade</w:t>
+            </w:r>
+          </w:p>
+        </w:tc>
+      </w:tr>
+      <w:tr>
+        <w:tc>
+          <w:tcPr>
+            <w:tcW w:w="2966" w:type="dxa"/>
+            <w:gridSpan w:val="3"/>
+          </w:tcPr>
+          <w:p>
+            <w:pPr>
+              <w:spacing w:line="360" w:lineRule="auto"/>
+              <w:rPr>
+                <w:szCs w:val="24"/>
+              </w:rPr>
+            </w:pPr>
+            <w:r>
+              <w:rPr>
+                <w:szCs w:val="24"/>
+              </w:rPr>
+              <w:t>NF9.</w:t>
+            </w:r>
+            <w:r>
+              <w:rPr>
+                <w:szCs w:val="24"/>
+              </w:rPr>
+              <w:t>3</w:t>
+            </w:r>
+            <w:r>
+              <w:rPr>
+                <w:szCs w:val="24"/>
+              </w:rPr>
+              <w:t xml:space="preserve"> </w:t>
+            </w:r>
+            <w:r>
+              <w:rPr>
+                <w:szCs w:val="24"/>
+              </w:rPr>
+              <w:t>Edição de Setor</w:t>
+            </w:r>
+          </w:p>
+          <w:p>
+            <w:pPr>
+              <w:spacing w:line="360" w:lineRule="auto"/>
+              <w:rPr>
+                <w:szCs w:val="24"/>
+              </w:rPr>
+            </w:pPr>
+          </w:p>
+        </w:tc>
+        <w:tc>
+          <w:tcPr>
+            <w:tcW w:w="3254" w:type="dxa"/>
+          </w:tcPr>
+          <w:p>
+            <w:pPr>
+              <w:spacing w:line="360" w:lineRule="auto"/>
+              <w:rPr>
+                <w:szCs w:val="24"/>
+              </w:rPr>
+            </w:pPr>
+            <w:r>
+              <w:t>O sistema deve permitir renomear um setor, mantendo a regra de não haver nomes duplicados na mesma empresa</w:t>
+            </w:r>
+            <w:r>
+              <w:t>.</w:t>
+            </w:r>
+          </w:p>
+        </w:tc>
+        <w:tc>
+          <w:tcPr>
+            <w:tcW w:w="2541" w:type="dxa"/>
+          </w:tcPr>
+          <w:p>
+            <w:pPr>
+              <w:spacing w:line="360" w:lineRule="auto"/>
+              <w:rPr>
+                <w:szCs w:val="24"/>
+              </w:rPr>
+            </w:pPr>
+            <w:r>
+              <w:rPr>
+                <w:szCs w:val="24"/>
+              </w:rPr>
+              <w:t>Usabilidade</w:t>
             </w:r>
           </w:p>
         </w:tc>
@@ -5864,6 +5989,7 @@
               <w:rPr>
                 <w:szCs w:val="24"/>
               </w:rPr>
+              <w:lastRenderedPageBreak/>
               <w:t>NF10</w:t>
             </w:r>
             <w:r>
@@ -6120,7 +6246,6 @@
                 <w:bCs/>
                 <w:szCs w:val="24"/>
               </w:rPr>
-              <w:lastRenderedPageBreak/>
               <w:t>F11</w:t>
             </w:r>
           </w:p>
@@ -6617,6 +6742,7 @@
                 <w:bCs/>
                 <w:szCs w:val="24"/>
               </w:rPr>
+              <w:lastRenderedPageBreak/>
               <w:t>Descrição</w:t>
             </w:r>
           </w:p>
@@ -7019,7 +7145,6 @@
               <w:rPr>
                 <w:szCs w:val="24"/>
               </w:rPr>
-              <w:lastRenderedPageBreak/>
               <w:t>NF12.3 Confirmação</w:t>
             </w:r>
           </w:p>
@@ -7144,13 +7269,8 @@
               </w:rPr>
             </w:pPr>
             <w:r>
-              <w:t xml:space="preserve">Visualizar </w:t>
-            </w:r>
-            <w:proofErr w:type="spellStart"/>
-            <w:r>
-              <w:t>Dashboard</w:t>
-            </w:r>
-            <w:proofErr w:type="spellEnd"/>
+              <w:t>Visualizar Dashboard</w:t>
+            </w:r>
           </w:p>
         </w:tc>
       </w:tr>
@@ -7234,15 +7354,7 @@
               </w:rPr>
             </w:pPr>
             <w:r>
-              <w:t xml:space="preserve">O administrador deve estar autenticado e </w:t>
-            </w:r>
-            <w:proofErr w:type="spellStart"/>
-            <w:r>
-              <w:t>com</w:t>
-            </w:r>
-            <w:proofErr w:type="spellEnd"/>
-            <w:r>
-              <w:t xml:space="preserve"> empresa cadastrada</w:t>
+              <w:t>O administrador deve estar autenticado e com empresa cadastrada</w:t>
             </w:r>
           </w:p>
         </w:tc>
@@ -7455,15 +7567,7 @@
               </w:rPr>
             </w:pPr>
             <w:r>
-              <w:t xml:space="preserve">Os dados do </w:t>
-            </w:r>
-            <w:proofErr w:type="spellStart"/>
-            <w:r>
-              <w:t>dashboard</w:t>
-            </w:r>
-            <w:proofErr w:type="spellEnd"/>
-            <w:r>
-              <w:t xml:space="preserve"> devem refletir o estado atual do banco de dados.</w:t>
+              <w:t>Os dados do dashboard devem refletir o estado atual do banco de dados.</w:t>
             </w:r>
           </w:p>
         </w:tc>
@@ -7504,6 +7608,7 @@
               <w:rPr>
                 <w:szCs w:val="24"/>
               </w:rPr>
+              <w:lastRenderedPageBreak/>
               <w:t>NF13</w:t>
             </w:r>
             <w:r>
@@ -7621,7 +7726,6 @@
                 <w:bCs/>
                 <w:szCs w:val="24"/>
               </w:rPr>
-              <w:lastRenderedPageBreak/>
               <w:t>F14</w:t>
             </w:r>
           </w:p>
@@ -8014,7 +8118,11 @@
               </w:rPr>
             </w:pPr>
             <w:r>
-              <w:t xml:space="preserve">O sistema deve exibir a mesma mensagem independente de o e-mail existir, para não revelar contas cadastradas </w:t>
+              <w:t xml:space="preserve">O sistema deve exibir a mesma mensagem independente de o e-mail </w:t>
+            </w:r>
+            <w:r>
+              <w:lastRenderedPageBreak/>
+              <w:t xml:space="preserve">existir, para não revelar contas cadastradas </w:t>
             </w:r>
           </w:p>
         </w:tc>
@@ -8033,6 +8141,7 @@
               <w:rPr>
                 <w:szCs w:val="24"/>
               </w:rPr>
+              <w:lastRenderedPageBreak/>
               <w:t>Segurança</w:t>
             </w:r>
           </w:p>
@@ -8418,7 +8527,6 @@
               <w:rPr>
                 <w:szCs w:val="24"/>
               </w:rPr>
-              <w:lastRenderedPageBreak/>
               <w:t>NF15</w:t>
             </w:r>
             <w:r>
@@ -8788,6 +8896,7 @@
                 <w:bCs/>
                 <w:szCs w:val="24"/>
               </w:rPr>
+              <w:lastRenderedPageBreak/>
               <w:t>Pós-condição</w:t>
             </w:r>
           </w:p>
@@ -9052,7 +9161,16 @@
               </w:rPr>
             </w:pPr>
             <w:r>
-              <w:t>O sistema deve exigir confirmação explícita no administrador antes de reativar</w:t>
+              <w:t xml:space="preserve">O sistema deve exigir </w:t>
+            </w:r>
+            <w:r>
+              <w:t>confirmação explícita do administrador</w:t>
+            </w:r>
+            <w:r>
+              <w:t xml:space="preserve"> </w:t>
+            </w:r>
+            <w:r>
+              <w:t>antes de reativar</w:t>
             </w:r>
           </w:p>
         </w:tc>
@@ -9156,7 +9274,7 @@
 </file>
 
 <file path=word/endnotes.xml><?xml version="1.0" encoding="utf-8"?>
-<w:endnotes xmlns:wpc="http://schemas.microsoft.com/office/word/2010/wordprocessingCanvas" xmlns:cx="http://schemas.microsoft.com/office/drawing/2014/chartex" xmlns:mc="http://schemas.openxmlformats.org/markup-compatibility/2006" xmlns:o="urn:schemas-microsoft-com:office:office" xmlns:r="http://schemas.openxmlformats.org/officeDocument/2006/relationships" xmlns:m="http://schemas.openxmlformats.org/officeDocument/2006/math" xmlns:v="urn:schemas-microsoft-com:vml" xmlns:wp14="http://schemas.microsoft.com/office/word/2010/wordprocessingDrawing" xmlns:wp="http://schemas.openxmlformats.org/drawingml/2006/wordprocessingDrawing" xmlns:w10="urn:schemas-microsoft-com:office:word" xmlns:w="http://schemas.openxmlformats.org/wordprocessingml/2006/main" xmlns:w14="http://schemas.microsoft.com/office/word/2010/wordml" xmlns:w15="http://schemas.microsoft.com/office/word/2012/wordml" xmlns:w16se="http://schemas.microsoft.com/office/word/2015/wordml/symex" xmlns:wpg="http://schemas.microsoft.com/office/word/2010/wordprocessingGroup" xmlns:wpi="http://schemas.microsoft.com/office/word/2010/wordprocessingInk" xmlns:wne="http://schemas.microsoft.com/office/word/2006/wordml" xmlns:wps="http://schemas.microsoft.com/office/word/2010/wordprocessingShape" mc:Ignorable="w14 w15 w16se wp14">
+<w:endnotes xmlns:wpc="http://schemas.microsoft.com/office/word/2010/wordprocessingCanvas" xmlns:cx="http://schemas.microsoft.com/office/drawing/2014/chartex" xmlns:cx1="http://schemas.microsoft.com/office/drawing/2015/9/8/chartex" xmlns:cx2="http://schemas.microsoft.com/office/drawing/2015/10/21/chartex" xmlns:cx3="http://schemas.microsoft.com/office/drawing/2016/5/9/chartex" xmlns:cx4="http://schemas.microsoft.com/office/drawing/2016/5/10/chartex" xmlns:cx5="http://schemas.microsoft.com/office/drawing/2016/5/11/chartex" xmlns:cx6="http://schemas.microsoft.com/office/drawing/2016/5/12/chartex" xmlns:cx7="http://schemas.microsoft.com/office/drawing/2016/5/13/chartex" xmlns:cx8="http://schemas.microsoft.com/office/drawing/2016/5/14/chartex" xmlns:mc="http://schemas.openxmlformats.org/markup-compatibility/2006" xmlns:aink="http://schemas.microsoft.com/office/drawing/2016/ink" xmlns:am3d="http://schemas.microsoft.com/office/drawing/2017/model3d" xmlns:o="urn:schemas-microsoft-com:office:office" xmlns:oel="http://schemas.microsoft.com/office/2019/extlst" xmlns:r="http://schemas.openxmlformats.org/officeDocument/2006/relationships" xmlns:m="http://schemas.openxmlformats.org/officeDocument/2006/math" xmlns:v="urn:schemas-microsoft-com:vml" xmlns:wp14="http://schemas.microsoft.com/office/word/2010/wordprocessingDrawing" xmlns:wp="http://schemas.openxmlformats.org/drawingml/2006/wordprocessingDrawing" xmlns:w10="urn:schemas-microsoft-com:office:word" xmlns:w="http://schemas.openxmlformats.org/wordprocessingml/2006/main" xmlns:w14="http://schemas.microsoft.com/office/word/2010/wordml" xmlns:w15="http://schemas.microsoft.com/office/word/2012/wordml" xmlns:w16cex="http://schemas.microsoft.com/office/word/2018/wordml/cex" xmlns:w16cid="http://schemas.microsoft.com/office/word/2016/wordml/cid" xmlns:w16="http://schemas.microsoft.com/office/word/2018/wordml" xmlns:w16du="http://schemas.microsoft.com/office/word/2023/wordml/word16du" xmlns:w16sdtdh="http://schemas.microsoft.com/office/word/2020/wordml/sdtdatahash" xmlns:w16sdtfl="http://schemas.microsoft.com/office/word/2024/wordml/sdtformatlock" xmlns:w16se="http://schemas.microsoft.com/office/word/2015/wordml/symex" xmlns:wpg="http://schemas.microsoft.com/office/word/2010/wordprocessingGroup" xmlns:wpi="http://schemas.microsoft.com/office/word/2010/wordprocessingInk" xmlns:wne="http://schemas.microsoft.com/office/word/2006/wordml" xmlns:wps="http://schemas.microsoft.com/office/word/2010/wordprocessingShape" mc:Ignorable="w14 w15 w16se w16cid w16 w16cex w16sdtdh w16sdtfl w16du wp14">
   <w:endnote w:type="separator" w:id="-1">
     <w:p>
       <w:pPr>
@@ -9181,7 +9299,7 @@
 </file>
 
 <file path=word/footnotes.xml><?xml version="1.0" encoding="utf-8"?>
-<w:footnotes xmlns:wpc="http://schemas.microsoft.com/office/word/2010/wordprocessingCanvas" xmlns:cx="http://schemas.microsoft.com/office/drawing/2014/chartex" xmlns:mc="http://schemas.openxmlformats.org/markup-compatibility/2006" xmlns:o="urn:schemas-microsoft-com:office:office" xmlns:r="http://schemas.openxmlformats.org/officeDocument/2006/relationships" xmlns:m="http://schemas.openxmlformats.org/officeDocument/2006/math" xmlns:v="urn:schemas-microsoft-com:vml" xmlns:wp14="http://schemas.microsoft.com/office/word/2010/wordprocessingDrawing" xmlns:wp="http://schemas.openxmlformats.org/drawingml/2006/wordprocessingDrawing" xmlns:w10="urn:schemas-microsoft-com:office:word" xmlns:w="http://schemas.openxmlformats.org/wordprocessingml/2006/main" xmlns:w14="http://schemas.microsoft.com/office/word/2010/wordml" xmlns:w15="http://schemas.microsoft.com/office/word/2012/wordml" xmlns:w16se="http://schemas.microsoft.com/office/word/2015/wordml/symex" xmlns:wpg="http://schemas.microsoft.com/office/word/2010/wordprocessingGroup" xmlns:wpi="http://schemas.microsoft.com/office/word/2010/wordprocessingInk" xmlns:wne="http://schemas.microsoft.com/office/word/2006/wordml" xmlns:wps="http://schemas.microsoft.com/office/word/2010/wordprocessingShape" mc:Ignorable="w14 w15 w16se wp14">
+<w:footnotes xmlns:wpc="http://schemas.microsoft.com/office/word/2010/wordprocessingCanvas" xmlns:cx="http://schemas.microsoft.com/office/drawing/2014/chartex" xmlns:cx1="http://schemas.microsoft.com/office/drawing/2015/9/8/chartex" xmlns:cx2="http://schemas.microsoft.com/office/drawing/2015/10/21/chartex" xmlns:cx3="http://schemas.microsoft.com/office/drawing/2016/5/9/chartex" xmlns:cx4="http://schemas.microsoft.com/office/drawing/2016/5/10/chartex" xmlns:cx5="http://schemas.microsoft.com/office/drawing/2016/5/11/chartex" xmlns:cx6="http://schemas.microsoft.com/office/drawing/2016/5/12/chartex" xmlns:cx7="http://schemas.microsoft.com/office/drawing/2016/5/13/chartex" xmlns:cx8="http://schemas.microsoft.com/office/drawing/2016/5/14/chartex" xmlns:mc="http://schemas.openxmlformats.org/markup-compatibility/2006" xmlns:aink="http://schemas.microsoft.com/office/drawing/2016/ink" xmlns:am3d="http://schemas.microsoft.com/office/drawing/2017/model3d" xmlns:o="urn:schemas-microsoft-com:office:office" xmlns:oel="http://schemas.microsoft.com/office/2019/extlst" xmlns:r="http://schemas.openxmlformats.org/officeDocument/2006/relationships" xmlns:m="http://schemas.openxmlformats.org/officeDocument/2006/math" xmlns:v="urn:schemas-microsoft-com:vml" xmlns:wp14="http://schemas.microsoft.com/office/word/2010/wordprocessingDrawing" xmlns:wp="http://schemas.openxmlformats.org/drawingml/2006/wordprocessingDrawing" xmlns:w10="urn:schemas-microsoft-com:office:word" xmlns:w="http://schemas.openxmlformats.org/wordprocessingml/2006/main" xmlns:w14="http://schemas.microsoft.com/office/word/2010/wordml" xmlns:w15="http://schemas.microsoft.com/office/word/2012/wordml" xmlns:w16cex="http://schemas.microsoft.com/office/word/2018/wordml/cex" xmlns:w16cid="http://schemas.microsoft.com/office/word/2016/wordml/cid" xmlns:w16="http://schemas.microsoft.com/office/word/2018/wordml" xmlns:w16du="http://schemas.microsoft.com/office/word/2023/wordml/word16du" xmlns:w16sdtdh="http://schemas.microsoft.com/office/word/2020/wordml/sdtdatahash" xmlns:w16sdtfl="http://schemas.microsoft.com/office/word/2024/wordml/sdtformatlock" xmlns:w16se="http://schemas.microsoft.com/office/word/2015/wordml/symex" xmlns:wpg="http://schemas.microsoft.com/office/word/2010/wordprocessingGroup" xmlns:wpi="http://schemas.microsoft.com/office/word/2010/wordprocessingInk" xmlns:wne="http://schemas.microsoft.com/office/word/2006/wordml" xmlns:wps="http://schemas.microsoft.com/office/word/2010/wordprocessingShape" mc:Ignorable="w14 w15 w16se w16cid w16 w16cex w16sdtdh w16sdtfl w16du wp14">
   <w:footnote w:type="separator" w:id="-1">
     <w:p>
       <w:pPr>
@@ -9206,7 +9324,7 @@
 </file>
 
 <file path=word/header1.xml><?xml version="1.0" encoding="utf-8"?>
-<w:hdr xmlns:wpc="http://schemas.microsoft.com/office/word/2010/wordprocessingCanvas" xmlns:cx="http://schemas.microsoft.com/office/drawing/2014/chartex" xmlns:mc="http://schemas.openxmlformats.org/markup-compatibility/2006" xmlns:o="urn:schemas-microsoft-com:office:office" xmlns:r="http://schemas.openxmlformats.org/officeDocument/2006/relationships" xmlns:m="http://schemas.openxmlformats.org/officeDocument/2006/math" xmlns:v="urn:schemas-microsoft-com:vml" xmlns:wp14="http://schemas.microsoft.com/office/word/2010/wordprocessingDrawing" xmlns:wp="http://schemas.openxmlformats.org/drawingml/2006/wordprocessingDrawing" xmlns:w10="urn:schemas-microsoft-com:office:word" xmlns:w="http://schemas.openxmlformats.org/wordprocessingml/2006/main" xmlns:w14="http://schemas.microsoft.com/office/word/2010/wordml" xmlns:w15="http://schemas.microsoft.com/office/word/2012/wordml" xmlns:w16se="http://schemas.microsoft.com/office/word/2015/wordml/symex" xmlns:wpg="http://schemas.microsoft.com/office/word/2010/wordprocessingGroup" xmlns:wpi="http://schemas.microsoft.com/office/word/2010/wordprocessingInk" xmlns:wne="http://schemas.microsoft.com/office/word/2006/wordml" xmlns:wps="http://schemas.microsoft.com/office/word/2010/wordprocessingShape" mc:Ignorable="w14 w15 w16se wp14">
+<w:hdr xmlns:wpc="http://schemas.microsoft.com/office/word/2010/wordprocessingCanvas" xmlns:cx="http://schemas.microsoft.com/office/drawing/2014/chartex" xmlns:cx1="http://schemas.microsoft.com/office/drawing/2015/9/8/chartex" xmlns:cx2="http://schemas.microsoft.com/office/drawing/2015/10/21/chartex" xmlns:cx3="http://schemas.microsoft.com/office/drawing/2016/5/9/chartex" xmlns:cx4="http://schemas.microsoft.com/office/drawing/2016/5/10/chartex" xmlns:cx5="http://schemas.microsoft.com/office/drawing/2016/5/11/chartex" xmlns:cx6="http://schemas.microsoft.com/office/drawing/2016/5/12/chartex" xmlns:cx7="http://schemas.microsoft.com/office/drawing/2016/5/13/chartex" xmlns:cx8="http://schemas.microsoft.com/office/drawing/2016/5/14/chartex" xmlns:mc="http://schemas.openxmlformats.org/markup-compatibility/2006" xmlns:aink="http://schemas.microsoft.com/office/drawing/2016/ink" xmlns:am3d="http://schemas.microsoft.com/office/drawing/2017/model3d" xmlns:o="urn:schemas-microsoft-com:office:office" xmlns:oel="http://schemas.microsoft.com/office/2019/extlst" xmlns:r="http://schemas.openxmlformats.org/officeDocument/2006/relationships" xmlns:m="http://schemas.openxmlformats.org/officeDocument/2006/math" xmlns:v="urn:schemas-microsoft-com:vml" xmlns:wp14="http://schemas.microsoft.com/office/word/2010/wordprocessingDrawing" xmlns:wp="http://schemas.openxmlformats.org/drawingml/2006/wordprocessingDrawing" xmlns:w10="urn:schemas-microsoft-com:office:word" xmlns:w="http://schemas.openxmlformats.org/wordprocessingml/2006/main" xmlns:w14="http://schemas.microsoft.com/office/word/2010/wordml" xmlns:w15="http://schemas.microsoft.com/office/word/2012/wordml" xmlns:w16cex="http://schemas.microsoft.com/office/word/2018/wordml/cex" xmlns:w16cid="http://schemas.microsoft.com/office/word/2016/wordml/cid" xmlns:w16="http://schemas.microsoft.com/office/word/2018/wordml" xmlns:w16du="http://schemas.microsoft.com/office/word/2023/wordml/word16du" xmlns:w16sdtdh="http://schemas.microsoft.com/office/word/2020/wordml/sdtdatahash" xmlns:w16sdtfl="http://schemas.microsoft.com/office/word/2024/wordml/sdtformatlock" xmlns:w16se="http://schemas.microsoft.com/office/word/2015/wordml/symex" xmlns:wpg="http://schemas.microsoft.com/office/word/2010/wordprocessingGroup" xmlns:wpi="http://schemas.microsoft.com/office/word/2010/wordprocessingInk" xmlns:wne="http://schemas.microsoft.com/office/word/2006/wordml" xmlns:wps="http://schemas.microsoft.com/office/word/2010/wordprocessingShape" mc:Ignorable="w14 w15 w16se w16cid w16 w16cex w16sdtdh w16sdtfl w16du wp14">
   <w:sdt>
     <w:sdtPr>
       <w:id w:val="-2110197828"/>
@@ -9251,7 +9369,7 @@
 </file>
 
 <file path=word/numbering.xml><?xml version="1.0" encoding="utf-8"?>
-<w:numbering xmlns:wpc="http://schemas.microsoft.com/office/word/2010/wordprocessingCanvas" xmlns:cx="http://schemas.microsoft.com/office/drawing/2014/chartex" xmlns:mc="http://schemas.openxmlformats.org/markup-compatibility/2006" xmlns:o="urn:schemas-microsoft-com:office:office" xmlns:r="http://schemas.openxmlformats.org/officeDocument/2006/relationships" xmlns:m="http://schemas.openxmlformats.org/officeDocument/2006/math" xmlns:v="urn:schemas-microsoft-com:vml" xmlns:wp14="http://schemas.microsoft.com/office/word/2010/wordprocessingDrawing" xmlns:wp="http://schemas.openxmlformats.org/drawingml/2006/wordprocessingDrawing" xmlns:w10="urn:schemas-microsoft-com:office:word" xmlns:w="http://schemas.openxmlformats.org/wordprocessingml/2006/main" xmlns:w14="http://schemas.microsoft.com/office/word/2010/wordml" xmlns:w15="http://schemas.microsoft.com/office/word/2012/wordml" xmlns:w16se="http://schemas.microsoft.com/office/word/2015/wordml/symex" xmlns:wpg="http://schemas.microsoft.com/office/word/2010/wordprocessingGroup" xmlns:wpi="http://schemas.microsoft.com/office/word/2010/wordprocessingInk" xmlns:wne="http://schemas.microsoft.com/office/word/2006/wordml" xmlns:wps="http://schemas.microsoft.com/office/word/2010/wordprocessingShape" mc:Ignorable="w14 w15 w16se wp14">
+<w:numbering xmlns:wpc="http://schemas.microsoft.com/office/word/2010/wordprocessingCanvas" xmlns:cx="http://schemas.microsoft.com/office/drawing/2014/chartex" xmlns:cx1="http://schemas.microsoft.com/office/drawing/2015/9/8/chartex" xmlns:cx2="http://schemas.microsoft.com/office/drawing/2015/10/21/chartex" xmlns:cx3="http://schemas.microsoft.com/office/drawing/2016/5/9/chartex" xmlns:cx4="http://schemas.microsoft.com/office/drawing/2016/5/10/chartex" xmlns:cx5="http://schemas.microsoft.com/office/drawing/2016/5/11/chartex" xmlns:cx6="http://schemas.microsoft.com/office/drawing/2016/5/12/chartex" xmlns:cx7="http://schemas.microsoft.com/office/drawing/2016/5/13/chartex" xmlns:cx8="http://schemas.microsoft.com/office/drawing/2016/5/14/chartex" xmlns:mc="http://schemas.openxmlformats.org/markup-compatibility/2006" xmlns:aink="http://schemas.microsoft.com/office/drawing/2016/ink" xmlns:am3d="http://schemas.microsoft.com/office/drawing/2017/model3d" xmlns:o="urn:schemas-microsoft-com:office:office" xmlns:oel="http://schemas.microsoft.com/office/2019/extlst" xmlns:r="http://schemas.openxmlformats.org/officeDocument/2006/relationships" xmlns:m="http://schemas.openxmlformats.org/officeDocument/2006/math" xmlns:v="urn:schemas-microsoft-com:vml" xmlns:wp14="http://schemas.microsoft.com/office/word/2010/wordprocessingDrawing" xmlns:wp="http://schemas.openxmlformats.org/drawingml/2006/wordprocessingDrawing" xmlns:w10="urn:schemas-microsoft-com:office:word" xmlns:w="http://schemas.openxmlformats.org/wordprocessingml/2006/main" xmlns:w14="http://schemas.microsoft.com/office/word/2010/wordml" xmlns:w15="http://schemas.microsoft.com/office/word/2012/wordml" xmlns:w16cex="http://schemas.microsoft.com/office/word/2018/wordml/cex" xmlns:w16cid="http://schemas.microsoft.com/office/word/2016/wordml/cid" xmlns:w16="http://schemas.microsoft.com/office/word/2018/wordml" xmlns:w16du="http://schemas.microsoft.com/office/word/2023/wordml/word16du" xmlns:w16sdtdh="http://schemas.microsoft.com/office/word/2020/wordml/sdtdatahash" xmlns:w16sdtfl="http://schemas.microsoft.com/office/word/2024/wordml/sdtformatlock" xmlns:w16se="http://schemas.microsoft.com/office/word/2015/wordml/symex" xmlns:wpg="http://schemas.microsoft.com/office/word/2010/wordprocessingGroup" xmlns:wpi="http://schemas.microsoft.com/office/word/2010/wordprocessingInk" xmlns:wne="http://schemas.microsoft.com/office/word/2006/wordml" xmlns:wps="http://schemas.microsoft.com/office/word/2010/wordprocessingShape" mc:Ignorable="w14 w15 w16se w16cid w16 w16cex w16sdtdh w16sdtfl w16du wp14">
   <w:abstractNum w:abstractNumId="0" w15:restartNumberingAfterBreak="0">
     <w:nsid w:val="1D772148"/>
     <w:multiLevelType w:val="multilevel"/>
@@ -9479,17 +9597,17 @@
       </w:rPr>
     </w:lvl>
   </w:abstractNum>
-  <w:num w:numId="1">
+  <w:num w:numId="1" w16cid:durableId="1676303849">
     <w:abstractNumId w:val="1"/>
   </w:num>
-  <w:num w:numId="2">
+  <w:num w:numId="2" w16cid:durableId="1553496129">
     <w:abstractNumId w:val="0"/>
   </w:num>
 </w:numbering>
 </file>
 
 <file path=word/styles.xml><?xml version="1.0" encoding="utf-8"?>
-<w:styles xmlns:mc="http://schemas.openxmlformats.org/markup-compatibility/2006" xmlns:r="http://schemas.openxmlformats.org/officeDocument/2006/relationships" xmlns:w="http://schemas.openxmlformats.org/wordprocessingml/2006/main" xmlns:w14="http://schemas.microsoft.com/office/word/2010/wordml" xmlns:w15="http://schemas.microsoft.com/office/word/2012/wordml" xmlns:w16se="http://schemas.microsoft.com/office/word/2015/wordml/symex" mc:Ignorable="w14 w15 w16se">
+<w:styles xmlns:mc="http://schemas.openxmlformats.org/markup-compatibility/2006" xmlns:r="http://schemas.openxmlformats.org/officeDocument/2006/relationships" xmlns:w="http://schemas.openxmlformats.org/wordprocessingml/2006/main" xmlns:w14="http://schemas.microsoft.com/office/word/2010/wordml" xmlns:w15="http://schemas.microsoft.com/office/word/2012/wordml" xmlns:w16cex="http://schemas.microsoft.com/office/word/2018/wordml/cex" xmlns:w16cid="http://schemas.microsoft.com/office/word/2016/wordml/cid" xmlns:w16="http://schemas.microsoft.com/office/word/2018/wordml" xmlns:w16du="http://schemas.microsoft.com/office/word/2023/wordml/word16du" xmlns:w16sdtdh="http://schemas.microsoft.com/office/word/2020/wordml/sdtdatahash" xmlns:w16sdtfl="http://schemas.microsoft.com/office/word/2024/wordml/sdtformatlock" xmlns:w16se="http://schemas.microsoft.com/office/word/2015/wordml/symex" mc:Ignorable="w14 w15 w16se w16cid w16 w16cex w16sdtdh w16sdtfl w16du">
   <w:docDefaults>
     <w:rPrDefault>
       <w:rPr>
@@ -9505,7 +9623,7 @@
       </w:pPr>
     </w:pPrDefault>
   </w:docDefaults>
-  <w:latentStyles w:defLockedState="0" w:defUIPriority="99" w:defSemiHidden="0" w:defUnhideWhenUsed="0" w:defQFormat="0" w:count="371">
+  <w:latentStyles w:defLockedState="0" w:defUIPriority="99" w:defSemiHidden="0" w:defUnhideWhenUsed="0" w:defQFormat="0" w:count="376">
     <w:lsdException w:name="Normal" w:uiPriority="0" w:qFormat="1"/>
     <w:lsdException w:name="heading 1" w:uiPriority="9" w:qFormat="1"/>
     <w:lsdException w:name="heading 2" w:semiHidden="1" w:uiPriority="9" w:unhideWhenUsed="1" w:qFormat="1"/>
@@ -9877,6 +9995,11 @@
     <w:lsdException w:name="List Table 5 Dark Accent 6" w:uiPriority="50"/>
     <w:lsdException w:name="List Table 6 Colorful Accent 6" w:uiPriority="51"/>
     <w:lsdException w:name="List Table 7 Colorful Accent 6" w:uiPriority="52"/>
+    <w:lsdException w:name="Mention" w:semiHidden="1" w:unhideWhenUsed="1"/>
+    <w:lsdException w:name="Smart Hyperlink" w:semiHidden="1" w:unhideWhenUsed="1"/>
+    <w:lsdException w:name="Hashtag" w:semiHidden="1" w:unhideWhenUsed="1"/>
+    <w:lsdException w:name="Unresolved Mention" w:semiHidden="1" w:unhideWhenUsed="1"/>
+    <w:lsdException w:name="Smart Link" w:semiHidden="1" w:unhideWhenUsed="1"/>
   </w:latentStyles>
   <w:style w:type="paragraph" w:default="1" w:styleId="Normal">
     <w:name w:val="Normal"/>
@@ -9894,7 +10017,6 @@
   <w:style w:type="character" w:default="1" w:styleId="Fontepargpadro">
     <w:name w:val="Default Paragraph Font"/>
     <w:uiPriority w:val="1"/>
-    <w:semiHidden/>
     <w:unhideWhenUsed/>
   </w:style>
   <w:style w:type="table" w:default="1" w:styleId="Tabelanormal">

</xml_diff>

<commit_message>
Adicionando a Regra de Negócios Editar EPI
</commit_message>
<xml_diff>
--- a/Documentação/Qualidade e Teste de Software/Requisitos/Requisitos - Atualizado - QTS.docx
+++ b/Documentação/Qualidade e Teste de Software/Requisitos/Requisitos - Atualizado - QTS.docx
@@ -5591,25 +5591,7 @@
               <w:rPr>
                 <w:szCs w:val="24"/>
               </w:rPr>
-              <w:t>NF9.</w:t>
-            </w:r>
-            <w:r>
-              <w:rPr>
-                <w:szCs w:val="24"/>
-              </w:rPr>
-              <w:t>3</w:t>
-            </w:r>
-            <w:r>
-              <w:rPr>
-                <w:szCs w:val="24"/>
-              </w:rPr>
-              <w:t xml:space="preserve"> </w:t>
-            </w:r>
-            <w:r>
-              <w:rPr>
-                <w:szCs w:val="24"/>
-              </w:rPr>
-              <w:t>Edição de Setor</w:t>
+              <w:t>NF9.3 Edição de Setor</w:t>
             </w:r>
           </w:p>
           <w:p>
@@ -9164,10 +9146,7 @@
               <w:t xml:space="preserve">O sistema deve exigir </w:t>
             </w:r>
             <w:r>
-              <w:t>confirmação explícita do administrador</w:t>
-            </w:r>
-            <w:r>
-              <w:t xml:space="preserve"> </w:t>
+              <w:t xml:space="preserve">confirmação explícita do administrador </w:t>
             </w:r>
             <w:r>
               <w:t>antes de reativar</w:t>
@@ -9236,6 +9215,483 @@
             </w:pPr>
             <w:r>
               <w:t>A reativação deve ser registrada no histórico do sistema</w:t>
+            </w:r>
+          </w:p>
+        </w:tc>
+        <w:tc>
+          <w:tcPr>
+            <w:tcW w:w="2541" w:type="dxa"/>
+          </w:tcPr>
+          <w:p>
+            <w:pPr>
+              <w:spacing w:line="360" w:lineRule="auto"/>
+              <w:rPr>
+                <w:szCs w:val="24"/>
+              </w:rPr>
+            </w:pPr>
+            <w:r>
+              <w:rPr>
+                <w:szCs w:val="24"/>
+              </w:rPr>
+              <w:t>Confiabilidade</w:t>
+            </w:r>
+          </w:p>
+        </w:tc>
+      </w:tr>
+    </w:tbl>
+    <w:p/>
+    <w:tbl>
+      <w:tblPr>
+        <w:tblStyle w:val="Tabelacomgrade"/>
+        <w:tblW w:w="0" w:type="auto"/>
+        <w:tblLook w:val="04A0" w:firstRow="1" w:lastRow="0" w:firstColumn="1" w:lastColumn="0" w:noHBand="0" w:noVBand="1"/>
+      </w:tblPr>
+      <w:tblGrid>
+        <w:gridCol w:w="1364"/>
+        <w:gridCol w:w="539"/>
+        <w:gridCol w:w="1063"/>
+        <w:gridCol w:w="3254"/>
+        <w:gridCol w:w="2541"/>
+      </w:tblGrid>
+      <w:tr>
+        <w:tc>
+          <w:tcPr>
+            <w:tcW w:w="1364" w:type="dxa"/>
+          </w:tcPr>
+          <w:p>
+            <w:pPr>
+              <w:spacing w:line="360" w:lineRule="auto"/>
+              <w:rPr>
+                <w:b/>
+                <w:bCs/>
+                <w:szCs w:val="24"/>
+              </w:rPr>
+            </w:pPr>
+            <w:r>
+              <w:rPr>
+                <w:b/>
+                <w:bCs/>
+                <w:szCs w:val="24"/>
+              </w:rPr>
+              <w:t>F1</w:t>
+            </w:r>
+            <w:r>
+              <w:rPr>
+                <w:b/>
+                <w:bCs/>
+                <w:szCs w:val="24"/>
+              </w:rPr>
+              <w:t>7</w:t>
+            </w:r>
+          </w:p>
+        </w:tc>
+        <w:tc>
+          <w:tcPr>
+            <w:tcW w:w="7397" w:type="dxa"/>
+            <w:gridSpan w:val="4"/>
+          </w:tcPr>
+          <w:p>
+            <w:pPr>
+              <w:spacing w:line="360" w:lineRule="auto"/>
+              <w:rPr>
+                <w:szCs w:val="24"/>
+              </w:rPr>
+            </w:pPr>
+            <w:r>
+              <w:t>Editar EPI</w:t>
+            </w:r>
+          </w:p>
+        </w:tc>
+      </w:tr>
+      <w:tr>
+        <w:tc>
+          <w:tcPr>
+            <w:tcW w:w="1364" w:type="dxa"/>
+          </w:tcPr>
+          <w:p>
+            <w:pPr>
+              <w:spacing w:line="360" w:lineRule="auto"/>
+              <w:rPr>
+                <w:b/>
+                <w:bCs/>
+                <w:szCs w:val="24"/>
+              </w:rPr>
+            </w:pPr>
+            <w:r>
+              <w:rPr>
+                <w:b/>
+                <w:bCs/>
+                <w:szCs w:val="24"/>
+              </w:rPr>
+              <w:t>Descrição</w:t>
+            </w:r>
+          </w:p>
+        </w:tc>
+        <w:tc>
+          <w:tcPr>
+            <w:tcW w:w="7397" w:type="dxa"/>
+            <w:gridSpan w:val="4"/>
+          </w:tcPr>
+          <w:p>
+            <w:pPr>
+              <w:spacing w:line="360" w:lineRule="auto"/>
+              <w:rPr>
+                <w:szCs w:val="24"/>
+              </w:rPr>
+            </w:pPr>
+            <w:r>
+              <w:t>Administrador edita os dados de um EPI já cadastrado (nome, tamanho, descrição, CA, validade do CA, categoria e setores vinculados)</w:t>
+            </w:r>
+          </w:p>
+        </w:tc>
+      </w:tr>
+      <w:tr>
+        <w:tc>
+          <w:tcPr>
+            <w:tcW w:w="1903" w:type="dxa"/>
+            <w:gridSpan w:val="2"/>
+          </w:tcPr>
+          <w:p>
+            <w:pPr>
+              <w:spacing w:line="360" w:lineRule="auto"/>
+              <w:rPr>
+                <w:b/>
+                <w:bCs/>
+                <w:szCs w:val="24"/>
+              </w:rPr>
+            </w:pPr>
+            <w:r>
+              <w:rPr>
+                <w:b/>
+                <w:bCs/>
+                <w:szCs w:val="24"/>
+              </w:rPr>
+              <w:t>Pré-condição</w:t>
+            </w:r>
+          </w:p>
+        </w:tc>
+        <w:tc>
+          <w:tcPr>
+            <w:tcW w:w="6858" w:type="dxa"/>
+            <w:gridSpan w:val="3"/>
+          </w:tcPr>
+          <w:p>
+            <w:pPr>
+              <w:spacing w:line="360" w:lineRule="auto"/>
+              <w:rPr>
+                <w:szCs w:val="24"/>
+              </w:rPr>
+            </w:pPr>
+            <w:r>
+              <w:t>Usuário autenticado como administrador e o EPI deve estar cadastrado e ativo</w:t>
+            </w:r>
+          </w:p>
+        </w:tc>
+      </w:tr>
+      <w:tr>
+        <w:tc>
+          <w:tcPr>
+            <w:tcW w:w="1903" w:type="dxa"/>
+            <w:gridSpan w:val="2"/>
+          </w:tcPr>
+          <w:p>
+            <w:pPr>
+              <w:spacing w:line="360" w:lineRule="auto"/>
+              <w:rPr>
+                <w:b/>
+                <w:bCs/>
+                <w:szCs w:val="24"/>
+              </w:rPr>
+            </w:pPr>
+            <w:r>
+              <w:rPr>
+                <w:b/>
+                <w:bCs/>
+                <w:szCs w:val="24"/>
+              </w:rPr>
+              <w:t>Pós-condição</w:t>
+            </w:r>
+          </w:p>
+        </w:tc>
+        <w:tc>
+          <w:tcPr>
+            <w:tcW w:w="6858" w:type="dxa"/>
+            <w:gridSpan w:val="3"/>
+          </w:tcPr>
+          <w:p>
+            <w:pPr>
+              <w:spacing w:line="360" w:lineRule="auto"/>
+              <w:rPr>
+                <w:szCs w:val="24"/>
+              </w:rPr>
+            </w:pPr>
+            <w:r>
+              <w:t>Os dados do EPI são atualizados no banco de dados e a alteração é registrada no histórico</w:t>
+            </w:r>
+          </w:p>
+        </w:tc>
+      </w:tr>
+      <w:tr>
+        <w:tc>
+          <w:tcPr>
+            <w:tcW w:w="8761" w:type="dxa"/>
+            <w:gridSpan w:val="5"/>
+          </w:tcPr>
+          <w:p>
+            <w:pPr>
+              <w:spacing w:line="360" w:lineRule="auto"/>
+              <w:jc w:val="center"/>
+              <w:rPr>
+                <w:b/>
+                <w:bCs/>
+                <w:szCs w:val="24"/>
+              </w:rPr>
+            </w:pPr>
+            <w:r>
+              <w:rPr>
+                <w:b/>
+                <w:bCs/>
+                <w:szCs w:val="24"/>
+              </w:rPr>
+              <w:t>Requisitos Não Funcional</w:t>
+            </w:r>
+          </w:p>
+        </w:tc>
+      </w:tr>
+      <w:tr>
+        <w:tc>
+          <w:tcPr>
+            <w:tcW w:w="2966" w:type="dxa"/>
+            <w:gridSpan w:val="3"/>
+          </w:tcPr>
+          <w:p>
+            <w:pPr>
+              <w:spacing w:line="360" w:lineRule="auto"/>
+              <w:jc w:val="center"/>
+              <w:rPr>
+                <w:b/>
+                <w:bCs/>
+                <w:szCs w:val="24"/>
+              </w:rPr>
+            </w:pPr>
+            <w:proofErr w:type="spellStart"/>
+            <w:r>
+              <w:rPr>
+                <w:b/>
+                <w:bCs/>
+                <w:szCs w:val="24"/>
+              </w:rPr>
+              <w:t>Cód</w:t>
+            </w:r>
+            <w:proofErr w:type="spellEnd"/>
+            <w:r>
+              <w:rPr>
+                <w:b/>
+                <w:bCs/>
+                <w:szCs w:val="24"/>
+              </w:rPr>
+              <w:t>-Nome</w:t>
+            </w:r>
+          </w:p>
+        </w:tc>
+        <w:tc>
+          <w:tcPr>
+            <w:tcW w:w="3254" w:type="dxa"/>
+          </w:tcPr>
+          <w:p>
+            <w:pPr>
+              <w:spacing w:line="360" w:lineRule="auto"/>
+              <w:jc w:val="center"/>
+              <w:rPr>
+                <w:b/>
+                <w:bCs/>
+                <w:szCs w:val="24"/>
+              </w:rPr>
+            </w:pPr>
+            <w:r>
+              <w:rPr>
+                <w:b/>
+                <w:bCs/>
+                <w:szCs w:val="24"/>
+              </w:rPr>
+              <w:t>Descrição</w:t>
+            </w:r>
+          </w:p>
+        </w:tc>
+        <w:tc>
+          <w:tcPr>
+            <w:tcW w:w="2541" w:type="dxa"/>
+          </w:tcPr>
+          <w:p>
+            <w:pPr>
+              <w:spacing w:line="360" w:lineRule="auto"/>
+              <w:jc w:val="center"/>
+              <w:rPr>
+                <w:b/>
+                <w:bCs/>
+                <w:szCs w:val="24"/>
+              </w:rPr>
+            </w:pPr>
+            <w:r>
+              <w:rPr>
+                <w:b/>
+                <w:bCs/>
+                <w:szCs w:val="24"/>
+              </w:rPr>
+              <w:t>Categoria</w:t>
+            </w:r>
+          </w:p>
+        </w:tc>
+      </w:tr>
+      <w:tr>
+        <w:tc>
+          <w:tcPr>
+            <w:tcW w:w="2966" w:type="dxa"/>
+            <w:gridSpan w:val="3"/>
+          </w:tcPr>
+          <w:p>
+            <w:pPr>
+              <w:spacing w:line="360" w:lineRule="auto"/>
+              <w:rPr>
+                <w:szCs w:val="24"/>
+              </w:rPr>
+            </w:pPr>
+            <w:r>
+              <w:rPr>
+                <w:szCs w:val="24"/>
+              </w:rPr>
+              <w:t>NF17.1 Validação de dados</w:t>
+            </w:r>
+          </w:p>
+        </w:tc>
+        <w:tc>
+          <w:tcPr>
+            <w:tcW w:w="3254" w:type="dxa"/>
+          </w:tcPr>
+          <w:p>
+            <w:pPr>
+              <w:spacing w:line="360" w:lineRule="auto"/>
+              <w:rPr>
+                <w:szCs w:val="24"/>
+              </w:rPr>
+            </w:pPr>
+            <w:r>
+              <w:t>O sistema deve validar todos os campos obrigatórios.</w:t>
+            </w:r>
+          </w:p>
+        </w:tc>
+        <w:tc>
+          <w:tcPr>
+            <w:tcW w:w="2541" w:type="dxa"/>
+          </w:tcPr>
+          <w:p>
+            <w:pPr>
+              <w:spacing w:line="360" w:lineRule="auto"/>
+              <w:rPr>
+                <w:szCs w:val="24"/>
+              </w:rPr>
+            </w:pPr>
+            <w:r>
+              <w:rPr>
+                <w:szCs w:val="24"/>
+              </w:rPr>
+              <w:t>Usabilidade</w:t>
+            </w:r>
+          </w:p>
+        </w:tc>
+      </w:tr>
+      <w:tr>
+        <w:tc>
+          <w:tcPr>
+            <w:tcW w:w="2966" w:type="dxa"/>
+            <w:gridSpan w:val="3"/>
+          </w:tcPr>
+          <w:p>
+            <w:pPr>
+              <w:spacing w:line="360" w:lineRule="auto"/>
+              <w:rPr>
+                <w:szCs w:val="24"/>
+              </w:rPr>
+            </w:pPr>
+            <w:r>
+              <w:rPr>
+                <w:szCs w:val="24"/>
+              </w:rPr>
+              <w:t>NF17.2 Unicidade CA + tamanho</w:t>
+            </w:r>
+          </w:p>
+        </w:tc>
+        <w:tc>
+          <w:tcPr>
+            <w:tcW w:w="3254" w:type="dxa"/>
+          </w:tcPr>
+          <w:p>
+            <w:pPr>
+              <w:spacing w:line="360" w:lineRule="auto"/>
+              <w:rPr>
+                <w:szCs w:val="24"/>
+              </w:rPr>
+            </w:pPr>
+            <w:r>
+              <w:t>O sistema não deve permitir salvar um EPI com CA e tamanho iguais aos de outro EPI da mesma empresa.</w:t>
+            </w:r>
+          </w:p>
+        </w:tc>
+        <w:tc>
+          <w:tcPr>
+            <w:tcW w:w="2541" w:type="dxa"/>
+          </w:tcPr>
+          <w:p>
+            <w:pPr>
+              <w:spacing w:line="360" w:lineRule="auto"/>
+              <w:rPr>
+                <w:szCs w:val="24"/>
+              </w:rPr>
+            </w:pPr>
+            <w:r>
+              <w:rPr>
+                <w:szCs w:val="24"/>
+              </w:rPr>
+              <w:t>Segurança</w:t>
+            </w:r>
+          </w:p>
+        </w:tc>
+      </w:tr>
+      <w:tr>
+        <w:tc>
+          <w:tcPr>
+            <w:tcW w:w="2966" w:type="dxa"/>
+            <w:gridSpan w:val="3"/>
+          </w:tcPr>
+          <w:p>
+            <w:pPr>
+              <w:spacing w:line="360" w:lineRule="auto"/>
+              <w:rPr>
+                <w:szCs w:val="24"/>
+              </w:rPr>
+            </w:pPr>
+            <w:r>
+              <w:rPr>
+                <w:szCs w:val="24"/>
+              </w:rPr>
+              <w:lastRenderedPageBreak/>
+              <w:t>NF17.3 Registro histórico</w:t>
+            </w:r>
+          </w:p>
+        </w:tc>
+        <w:tc>
+          <w:tcPr>
+            <w:tcW w:w="3254" w:type="dxa"/>
+          </w:tcPr>
+          <w:p>
+            <w:pPr>
+              <w:spacing w:line="360" w:lineRule="auto"/>
+              <w:rPr>
+                <w:szCs w:val="24"/>
+              </w:rPr>
+            </w:pPr>
+            <w:r>
+              <w:t>A edição deve ser registrada no histórico do sistema.</w:t>
             </w:r>
           </w:p>
         </w:tc>
@@ -10098,6 +10554,34 @@
       <w:lang w:eastAsia="pt-BR"/>
     </w:rPr>
   </w:style>
+  <w:style w:type="paragraph" w:styleId="Rodap">
+    <w:name w:val="footer"/>
+    <w:basedOn w:val="Normal"/>
+    <w:link w:val="RodapChar"/>
+    <w:uiPriority w:val="99"/>
+    <w:unhideWhenUsed/>
+    <w:rsid w:val="00016417"/>
+    <w:pPr>
+      <w:tabs>
+        <w:tab w:val="center" w:pos="4252"/>
+        <w:tab w:val="right" w:pos="8504"/>
+      </w:tabs>
+      <w:spacing w:line="240" w:lineRule="auto"/>
+    </w:pPr>
+  </w:style>
+  <w:style w:type="character" w:customStyle="1" w:styleId="RodapChar">
+    <w:name w:val="Rodapé Char"/>
+    <w:basedOn w:val="Fontepargpadro"/>
+    <w:link w:val="Rodap"/>
+    <w:uiPriority w:val="99"/>
+    <w:rsid w:val="00016417"/>
+    <w:rPr>
+      <w:rFonts w:ascii="Arial" w:eastAsia="Arial" w:hAnsi="Arial" w:cs="Arial"/>
+      <w:color w:val="000000" w:themeColor="text1"/>
+      <w:sz w:val="24"/>
+      <w:lang w:eastAsia="pt-BR"/>
+    </w:rPr>
+  </w:style>
 </w:styles>
 </file>
 

</xml_diff>

<commit_message>
Inserção da Regra de Negócio na documentação e atualização da nova versão do sw.js
</commit_message>
<xml_diff>
--- a/Documentação/Qualidade e Teste de Software/Requisitos/Requisitos - Atualizado - QTS.docx
+++ b/Documentação/Qualidade e Teste de Software/Requisitos/Requisitos - Atualizado - QTS.docx
@@ -607,21 +607,7 @@
         <w:rPr>
           <w:szCs w:val="24"/>
         </w:rPr>
-        <w:t xml:space="preserve"> Escola Técnica Estadual Ilza Nascimento </w:t>
-      </w:r>
-      <w:proofErr w:type="spellStart"/>
-      <w:r>
-        <w:rPr>
-          <w:szCs w:val="24"/>
-        </w:rPr>
-        <w:t>Pintus</w:t>
-      </w:r>
-      <w:proofErr w:type="spellEnd"/>
-      <w:r>
-        <w:rPr>
-          <w:szCs w:val="24"/>
-        </w:rPr>
-        <w:t xml:space="preserve"> como requisito para conclusão do curso de Desenvolvimento de Sistemas</w:t>
+        <w:t xml:space="preserve"> Escola Técnica Estadual Ilza Nascimento Pintus como requisito para conclusão do curso de Desenvolvimento de Sistemas</w:t>
       </w:r>
     </w:p>
     <w:p>
@@ -1029,23 +1015,13 @@
                 <w:szCs w:val="24"/>
               </w:rPr>
             </w:pPr>
-            <w:proofErr w:type="spellStart"/>
-            <w:r>
-              <w:rPr>
-                <w:b/>
-                <w:bCs/>
-                <w:szCs w:val="24"/>
-              </w:rPr>
-              <w:t>Cód</w:t>
-            </w:r>
-            <w:proofErr w:type="spellEnd"/>
-            <w:r>
-              <w:rPr>
-                <w:b/>
-                <w:bCs/>
-                <w:szCs w:val="24"/>
-              </w:rPr>
-              <w:t>-Nome</w:t>
+            <w:r>
+              <w:rPr>
+                <w:b/>
+                <w:bCs/>
+                <w:szCs w:val="24"/>
+              </w:rPr>
+              <w:t>Cód-Nome</w:t>
             </w:r>
           </w:p>
         </w:tc>
@@ -1181,16 +1157,8 @@
               <w:rPr>
                 <w:szCs w:val="24"/>
               </w:rPr>
-              <w:t xml:space="preserve">NF1.2 Validar </w:t>
-            </w:r>
-            <w:proofErr w:type="spellStart"/>
-            <w:r>
-              <w:rPr>
-                <w:szCs w:val="24"/>
-              </w:rPr>
-              <w:t>Captcha</w:t>
-            </w:r>
-            <w:proofErr w:type="spellEnd"/>
+              <w:t>NF1.2 Validar Captcha</w:t>
+            </w:r>
           </w:p>
         </w:tc>
         <w:tc>
@@ -1208,21 +1176,7 @@
               <w:rPr>
                 <w:szCs w:val="24"/>
               </w:rPr>
-              <w:t xml:space="preserve">O usuário deve confirmar </w:t>
-            </w:r>
-            <w:proofErr w:type="spellStart"/>
-            <w:r>
-              <w:rPr>
-                <w:szCs w:val="24"/>
-              </w:rPr>
-              <w:t>captcha</w:t>
-            </w:r>
-            <w:proofErr w:type="spellEnd"/>
-            <w:r>
-              <w:rPr>
-                <w:szCs w:val="24"/>
-              </w:rPr>
-              <w:t xml:space="preserve"> para evitar acessos automatizados/robôs</w:t>
+              <w:t>O usuário deve confirmar captcha para evitar acessos automatizados/robôs</w:t>
             </w:r>
             <w:r>
               <w:rPr>
@@ -1658,23 +1612,13 @@
                 <w:szCs w:val="24"/>
               </w:rPr>
             </w:pPr>
-            <w:proofErr w:type="spellStart"/>
-            <w:r>
-              <w:rPr>
-                <w:b/>
-                <w:bCs/>
-                <w:szCs w:val="24"/>
-              </w:rPr>
-              <w:t>Cód</w:t>
-            </w:r>
-            <w:proofErr w:type="spellEnd"/>
-            <w:r>
-              <w:rPr>
-                <w:b/>
-                <w:bCs/>
-                <w:szCs w:val="24"/>
-              </w:rPr>
-              <w:t>-Nome</w:t>
+            <w:r>
+              <w:rPr>
+                <w:b/>
+                <w:bCs/>
+                <w:szCs w:val="24"/>
+              </w:rPr>
+              <w:t>Cód-Nome</w:t>
             </w:r>
           </w:p>
         </w:tc>
@@ -2216,23 +2160,13 @@
                 <w:szCs w:val="24"/>
               </w:rPr>
             </w:pPr>
-            <w:proofErr w:type="spellStart"/>
-            <w:r>
-              <w:rPr>
-                <w:b/>
-                <w:bCs/>
-                <w:szCs w:val="24"/>
-              </w:rPr>
-              <w:t>Cód</w:t>
-            </w:r>
-            <w:proofErr w:type="spellEnd"/>
-            <w:r>
-              <w:rPr>
-                <w:b/>
-                <w:bCs/>
-                <w:szCs w:val="24"/>
-              </w:rPr>
-              <w:t>-Nome</w:t>
+            <w:r>
+              <w:rPr>
+                <w:b/>
+                <w:bCs/>
+                <w:szCs w:val="24"/>
+              </w:rPr>
+              <w:t>Cód-Nome</w:t>
             </w:r>
           </w:p>
         </w:tc>
@@ -2792,23 +2726,13 @@
                 <w:szCs w:val="24"/>
               </w:rPr>
             </w:pPr>
-            <w:proofErr w:type="spellStart"/>
-            <w:r>
-              <w:rPr>
-                <w:b/>
-                <w:bCs/>
-                <w:szCs w:val="24"/>
-              </w:rPr>
-              <w:t>Cód</w:t>
-            </w:r>
-            <w:proofErr w:type="spellEnd"/>
-            <w:r>
-              <w:rPr>
-                <w:b/>
-                <w:bCs/>
-                <w:szCs w:val="24"/>
-              </w:rPr>
-              <w:t>-Nome</w:t>
+            <w:r>
+              <w:rPr>
+                <w:b/>
+                <w:bCs/>
+                <w:szCs w:val="24"/>
+              </w:rPr>
+              <w:t>Cód-Nome</w:t>
             </w:r>
           </w:p>
         </w:tc>
@@ -3323,23 +3247,13 @@
                 <w:szCs w:val="24"/>
               </w:rPr>
             </w:pPr>
-            <w:proofErr w:type="spellStart"/>
-            <w:r>
-              <w:rPr>
-                <w:b/>
-                <w:bCs/>
-                <w:szCs w:val="24"/>
-              </w:rPr>
-              <w:t>Cód</w:t>
-            </w:r>
-            <w:proofErr w:type="spellEnd"/>
-            <w:r>
-              <w:rPr>
-                <w:b/>
-                <w:bCs/>
-                <w:szCs w:val="24"/>
-              </w:rPr>
-              <w:t>-Nome</w:t>
+            <w:r>
+              <w:rPr>
+                <w:b/>
+                <w:bCs/>
+                <w:szCs w:val="24"/>
+              </w:rPr>
+              <w:t>Cód-Nome</w:t>
             </w:r>
           </w:p>
         </w:tc>
@@ -3801,23 +3715,13 @@
                 <w:szCs w:val="24"/>
               </w:rPr>
             </w:pPr>
-            <w:proofErr w:type="spellStart"/>
-            <w:r>
-              <w:rPr>
-                <w:b/>
-                <w:bCs/>
-                <w:szCs w:val="24"/>
-              </w:rPr>
-              <w:t>Cód</w:t>
-            </w:r>
-            <w:proofErr w:type="spellEnd"/>
-            <w:r>
-              <w:rPr>
-                <w:b/>
-                <w:bCs/>
-                <w:szCs w:val="24"/>
-              </w:rPr>
-              <w:t>-Nome</w:t>
+            <w:r>
+              <w:rPr>
+                <w:b/>
+                <w:bCs/>
+                <w:szCs w:val="24"/>
+              </w:rPr>
+              <w:t>Cód-Nome</w:t>
             </w:r>
           </w:p>
         </w:tc>
@@ -4313,23 +4217,13 @@
                 <w:szCs w:val="24"/>
               </w:rPr>
             </w:pPr>
-            <w:proofErr w:type="spellStart"/>
-            <w:r>
-              <w:rPr>
-                <w:b/>
-                <w:bCs/>
-                <w:szCs w:val="24"/>
-              </w:rPr>
-              <w:t>Cód</w:t>
-            </w:r>
-            <w:proofErr w:type="spellEnd"/>
-            <w:r>
-              <w:rPr>
-                <w:b/>
-                <w:bCs/>
-                <w:szCs w:val="24"/>
-              </w:rPr>
-              <w:t>-Nome</w:t>
+            <w:r>
+              <w:rPr>
+                <w:b/>
+                <w:bCs/>
+                <w:szCs w:val="24"/>
+              </w:rPr>
+              <w:t>Cód-Nome</w:t>
             </w:r>
           </w:p>
         </w:tc>
@@ -4790,23 +4684,13 @@
                 <w:szCs w:val="24"/>
               </w:rPr>
             </w:pPr>
-            <w:proofErr w:type="spellStart"/>
-            <w:r>
-              <w:rPr>
-                <w:b/>
-                <w:bCs/>
-                <w:szCs w:val="24"/>
-              </w:rPr>
-              <w:t>Cód</w:t>
-            </w:r>
-            <w:proofErr w:type="spellEnd"/>
-            <w:r>
-              <w:rPr>
-                <w:b/>
-                <w:bCs/>
-                <w:szCs w:val="24"/>
-              </w:rPr>
-              <w:t>-Nome</w:t>
+            <w:r>
+              <w:rPr>
+                <w:b/>
+                <w:bCs/>
+                <w:szCs w:val="24"/>
+              </w:rPr>
+              <w:t>Cód-Nome</w:t>
             </w:r>
           </w:p>
         </w:tc>
@@ -5363,23 +5247,13 @@
                 <w:szCs w:val="24"/>
               </w:rPr>
             </w:pPr>
-            <w:proofErr w:type="spellStart"/>
-            <w:r>
-              <w:rPr>
-                <w:b/>
-                <w:bCs/>
-                <w:szCs w:val="24"/>
-              </w:rPr>
-              <w:t>Cód</w:t>
-            </w:r>
-            <w:proofErr w:type="spellEnd"/>
-            <w:r>
-              <w:rPr>
-                <w:b/>
-                <w:bCs/>
-                <w:szCs w:val="24"/>
-              </w:rPr>
-              <w:t>-Nome</w:t>
+            <w:r>
+              <w:rPr>
+                <w:b/>
+                <w:bCs/>
+                <w:szCs w:val="24"/>
+              </w:rPr>
+              <w:t>Cód-Nome</w:t>
             </w:r>
           </w:p>
         </w:tc>
@@ -5885,23 +5759,13 @@
                 <w:szCs w:val="24"/>
               </w:rPr>
             </w:pPr>
-            <w:proofErr w:type="spellStart"/>
-            <w:r>
-              <w:rPr>
-                <w:b/>
-                <w:bCs/>
-                <w:szCs w:val="24"/>
-              </w:rPr>
-              <w:t>Cód</w:t>
-            </w:r>
-            <w:proofErr w:type="spellEnd"/>
-            <w:r>
-              <w:rPr>
-                <w:b/>
-                <w:bCs/>
-                <w:szCs w:val="24"/>
-              </w:rPr>
-              <w:t>-Nome</w:t>
+            <w:r>
+              <w:rPr>
+                <w:b/>
+                <w:bCs/>
+                <w:szCs w:val="24"/>
+              </w:rPr>
+              <w:t>Cód-Nome</w:t>
             </w:r>
           </w:p>
         </w:tc>
@@ -6421,23 +6285,13 @@
                 <w:szCs w:val="24"/>
               </w:rPr>
             </w:pPr>
-            <w:proofErr w:type="spellStart"/>
-            <w:r>
-              <w:rPr>
-                <w:b/>
-                <w:bCs/>
-                <w:szCs w:val="24"/>
-              </w:rPr>
-              <w:t>Cód</w:t>
-            </w:r>
-            <w:proofErr w:type="spellEnd"/>
-            <w:r>
-              <w:rPr>
-                <w:b/>
-                <w:bCs/>
-                <w:szCs w:val="24"/>
-              </w:rPr>
-              <w:t>-Nome</w:t>
+            <w:r>
+              <w:rPr>
+                <w:b/>
+                <w:bCs/>
+                <w:szCs w:val="24"/>
+              </w:rPr>
+              <w:t>Cód-Nome</w:t>
             </w:r>
           </w:p>
         </w:tc>
@@ -6876,23 +6730,13 @@
                 <w:szCs w:val="24"/>
               </w:rPr>
             </w:pPr>
-            <w:proofErr w:type="spellStart"/>
-            <w:r>
-              <w:rPr>
-                <w:b/>
-                <w:bCs/>
-                <w:szCs w:val="24"/>
-              </w:rPr>
-              <w:t>Cód</w:t>
-            </w:r>
-            <w:proofErr w:type="spellEnd"/>
-            <w:r>
-              <w:rPr>
-                <w:b/>
-                <w:bCs/>
-                <w:szCs w:val="24"/>
-              </w:rPr>
-              <w:t>-Nome</w:t>
+            <w:r>
+              <w:rPr>
+                <w:b/>
+                <w:bCs/>
+                <w:szCs w:val="24"/>
+              </w:rPr>
+              <w:t>Cód-Nome</w:t>
             </w:r>
           </w:p>
         </w:tc>
@@ -7427,23 +7271,13 @@
                 <w:szCs w:val="24"/>
               </w:rPr>
             </w:pPr>
-            <w:proofErr w:type="spellStart"/>
-            <w:r>
-              <w:rPr>
-                <w:b/>
-                <w:bCs/>
-                <w:szCs w:val="24"/>
-              </w:rPr>
-              <w:t>Cód</w:t>
-            </w:r>
-            <w:proofErr w:type="spellEnd"/>
-            <w:r>
-              <w:rPr>
-                <w:b/>
-                <w:bCs/>
-                <w:szCs w:val="24"/>
-              </w:rPr>
-              <w:t>-Nome</w:t>
+            <w:r>
+              <w:rPr>
+                <w:b/>
+                <w:bCs/>
+                <w:szCs w:val="24"/>
+              </w:rPr>
+              <w:t>Cód-Nome</w:t>
             </w:r>
           </w:p>
         </w:tc>
@@ -7901,23 +7735,13 @@
                 <w:szCs w:val="24"/>
               </w:rPr>
             </w:pPr>
-            <w:proofErr w:type="spellStart"/>
-            <w:r>
-              <w:rPr>
-                <w:b/>
-                <w:bCs/>
-                <w:szCs w:val="24"/>
-              </w:rPr>
-              <w:t>Cód</w:t>
-            </w:r>
-            <w:proofErr w:type="spellEnd"/>
-            <w:r>
-              <w:rPr>
-                <w:b/>
-                <w:bCs/>
-                <w:szCs w:val="24"/>
-              </w:rPr>
-              <w:t>-Nome</w:t>
+            <w:r>
+              <w:rPr>
+                <w:b/>
+                <w:bCs/>
+                <w:szCs w:val="24"/>
+              </w:rPr>
+              <w:t>Cód-Nome</w:t>
             </w:r>
           </w:p>
         </w:tc>
@@ -8423,23 +8247,13 @@
                 <w:szCs w:val="24"/>
               </w:rPr>
             </w:pPr>
-            <w:proofErr w:type="spellStart"/>
-            <w:r>
-              <w:rPr>
-                <w:b/>
-                <w:bCs/>
-                <w:szCs w:val="24"/>
-              </w:rPr>
-              <w:t>Cód</w:t>
-            </w:r>
-            <w:proofErr w:type="spellEnd"/>
-            <w:r>
-              <w:rPr>
-                <w:b/>
-                <w:bCs/>
-                <w:szCs w:val="24"/>
-              </w:rPr>
-              <w:t>-Nome</w:t>
+            <w:r>
+              <w:rPr>
+                <w:b/>
+                <w:bCs/>
+                <w:szCs w:val="24"/>
+              </w:rPr>
+              <w:t>Cód-Nome</w:t>
             </w:r>
           </w:p>
         </w:tc>
@@ -8944,23 +8758,13 @@
                 <w:szCs w:val="24"/>
               </w:rPr>
             </w:pPr>
-            <w:proofErr w:type="spellStart"/>
-            <w:r>
-              <w:rPr>
-                <w:b/>
-                <w:bCs/>
-                <w:szCs w:val="24"/>
-              </w:rPr>
-              <w:t>Cód</w:t>
-            </w:r>
-            <w:proofErr w:type="spellEnd"/>
-            <w:r>
-              <w:rPr>
-                <w:b/>
-                <w:bCs/>
-                <w:szCs w:val="24"/>
-              </w:rPr>
-              <w:t>-Nome</w:t>
+            <w:r>
+              <w:rPr>
+                <w:b/>
+                <w:bCs/>
+                <w:szCs w:val="24"/>
+              </w:rPr>
+              <w:t>Cód-Nome</w:t>
             </w:r>
           </w:p>
         </w:tc>
@@ -9273,15 +9077,7 @@
                 <w:bCs/>
                 <w:szCs w:val="24"/>
               </w:rPr>
-              <w:t>F1</w:t>
-            </w:r>
-            <w:r>
-              <w:rPr>
-                <w:b/>
-                <w:bCs/>
-                <w:szCs w:val="24"/>
-              </w:rPr>
-              <w:t>7</w:t>
+              <w:t>F17</w:t>
             </w:r>
           </w:p>
         </w:tc>
@@ -9474,23 +9270,13 @@
                 <w:szCs w:val="24"/>
               </w:rPr>
             </w:pPr>
-            <w:proofErr w:type="spellStart"/>
-            <w:r>
-              <w:rPr>
-                <w:b/>
-                <w:bCs/>
-                <w:szCs w:val="24"/>
-              </w:rPr>
-              <w:t>Cód</w:t>
-            </w:r>
-            <w:proofErr w:type="spellEnd"/>
-            <w:r>
-              <w:rPr>
-                <w:b/>
-                <w:bCs/>
-                <w:szCs w:val="24"/>
-              </w:rPr>
-              <w:t>-Nome</w:t>
+            <w:r>
+              <w:rPr>
+                <w:b/>
+                <w:bCs/>
+                <w:szCs w:val="24"/>
+              </w:rPr>
+              <w:t>Cód-Nome</w:t>
             </w:r>
           </w:p>
         </w:tc>
@@ -9711,6 +9497,527 @@
                 <w:szCs w:val="24"/>
               </w:rPr>
               <w:t>Confiabilidade</w:t>
+            </w:r>
+          </w:p>
+        </w:tc>
+      </w:tr>
+    </w:tbl>
+    <w:p/>
+    <w:p/>
+    <w:tbl>
+      <w:tblPr>
+        <w:tblStyle w:val="Tabelacomgrade"/>
+        <w:tblW w:w="0" w:type="auto"/>
+        <w:tblLook w:val="04A0" w:firstRow="1" w:lastRow="0" w:firstColumn="1" w:lastColumn="0" w:noHBand="0" w:noVBand="1"/>
+      </w:tblPr>
+      <w:tblGrid>
+        <w:gridCol w:w="1364"/>
+        <w:gridCol w:w="539"/>
+        <w:gridCol w:w="1063"/>
+        <w:gridCol w:w="3254"/>
+        <w:gridCol w:w="2541"/>
+      </w:tblGrid>
+      <w:tr>
+        <w:tc>
+          <w:tcPr>
+            <w:tcW w:w="1364" w:type="dxa"/>
+          </w:tcPr>
+          <w:p>
+            <w:pPr>
+              <w:spacing w:line="360" w:lineRule="auto"/>
+              <w:rPr>
+                <w:b/>
+                <w:bCs/>
+                <w:szCs w:val="24"/>
+              </w:rPr>
+            </w:pPr>
+            <w:r>
+              <w:rPr>
+                <w:b/>
+                <w:bCs/>
+                <w:szCs w:val="24"/>
+              </w:rPr>
+              <w:t>F1</w:t>
+            </w:r>
+            <w:r>
+              <w:rPr>
+                <w:b/>
+                <w:bCs/>
+                <w:szCs w:val="24"/>
+              </w:rPr>
+              <w:t>8</w:t>
+            </w:r>
+          </w:p>
+        </w:tc>
+        <w:tc>
+          <w:tcPr>
+            <w:tcW w:w="7397" w:type="dxa"/>
+            <w:gridSpan w:val="4"/>
+          </w:tcPr>
+          <w:p>
+            <w:pPr>
+              <w:spacing w:line="360" w:lineRule="auto"/>
+              <w:rPr>
+                <w:szCs w:val="24"/>
+              </w:rPr>
+            </w:pPr>
+            <w:r>
+              <w:t>Importar EPIs em Lote</w:t>
+            </w:r>
+          </w:p>
+        </w:tc>
+      </w:tr>
+      <w:tr>
+        <w:tc>
+          <w:tcPr>
+            <w:tcW w:w="1364" w:type="dxa"/>
+          </w:tcPr>
+          <w:p>
+            <w:pPr>
+              <w:spacing w:line="360" w:lineRule="auto"/>
+              <w:rPr>
+                <w:b/>
+                <w:bCs/>
+                <w:szCs w:val="24"/>
+              </w:rPr>
+            </w:pPr>
+            <w:r>
+              <w:rPr>
+                <w:b/>
+                <w:bCs/>
+                <w:szCs w:val="24"/>
+              </w:rPr>
+              <w:t>Descrição</w:t>
+            </w:r>
+          </w:p>
+        </w:tc>
+        <w:tc>
+          <w:tcPr>
+            <w:tcW w:w="7397" w:type="dxa"/>
+            <w:gridSpan w:val="4"/>
+          </w:tcPr>
+          <w:p>
+            <w:pPr>
+              <w:spacing w:line="360" w:lineRule="auto"/>
+              <w:rPr>
+                <w:szCs w:val="24"/>
+              </w:rPr>
+            </w:pPr>
+            <w:r>
+              <w:t>Administrador importa vários EPIs de uma vez a partir de uma planilha (CSV), evitando o cadastro manual um a um</w:t>
+            </w:r>
+          </w:p>
+        </w:tc>
+      </w:tr>
+      <w:tr>
+        <w:tc>
+          <w:tcPr>
+            <w:tcW w:w="1903" w:type="dxa"/>
+            <w:gridSpan w:val="2"/>
+          </w:tcPr>
+          <w:p>
+            <w:pPr>
+              <w:spacing w:line="360" w:lineRule="auto"/>
+              <w:rPr>
+                <w:b/>
+                <w:bCs/>
+                <w:szCs w:val="24"/>
+              </w:rPr>
+            </w:pPr>
+            <w:r>
+              <w:rPr>
+                <w:b/>
+                <w:bCs/>
+                <w:szCs w:val="24"/>
+              </w:rPr>
+              <w:t>Pré-condição</w:t>
+            </w:r>
+          </w:p>
+        </w:tc>
+        <w:tc>
+          <w:tcPr>
+            <w:tcW w:w="6858" w:type="dxa"/>
+            <w:gridSpan w:val="3"/>
+          </w:tcPr>
+          <w:p>
+            <w:pPr>
+              <w:spacing w:line="360" w:lineRule="auto"/>
+              <w:rPr>
+                <w:szCs w:val="24"/>
+              </w:rPr>
+            </w:pPr>
+            <w:r>
+              <w:t>Usuário autenticado como administrador e com empresa cadastrada; a planilha deve seguir o modelo fornecido</w:t>
+            </w:r>
+          </w:p>
+        </w:tc>
+      </w:tr>
+      <w:tr>
+        <w:tc>
+          <w:tcPr>
+            <w:tcW w:w="1903" w:type="dxa"/>
+            <w:gridSpan w:val="2"/>
+          </w:tcPr>
+          <w:p>
+            <w:pPr>
+              <w:spacing w:line="360" w:lineRule="auto"/>
+              <w:rPr>
+                <w:b/>
+                <w:bCs/>
+                <w:szCs w:val="24"/>
+              </w:rPr>
+            </w:pPr>
+            <w:r>
+              <w:rPr>
+                <w:b/>
+                <w:bCs/>
+                <w:szCs w:val="24"/>
+              </w:rPr>
+              <w:t>Pós-condição</w:t>
+            </w:r>
+          </w:p>
+        </w:tc>
+        <w:tc>
+          <w:tcPr>
+            <w:tcW w:w="6858" w:type="dxa"/>
+            <w:gridSpan w:val="3"/>
+          </w:tcPr>
+          <w:p>
+            <w:pPr>
+              <w:spacing w:line="360" w:lineRule="auto"/>
+              <w:rPr>
+                <w:szCs w:val="24"/>
+              </w:rPr>
+            </w:pPr>
+            <w:r>
+              <w:t>Os EPIs válidos são cadastrados no banco de dados (com estoque inicial) e o sistema exibe um relatório com a quantidade importada e os erros por linha</w:t>
+            </w:r>
+          </w:p>
+        </w:tc>
+      </w:tr>
+      <w:tr>
+        <w:tc>
+          <w:tcPr>
+            <w:tcW w:w="8761" w:type="dxa"/>
+            <w:gridSpan w:val="5"/>
+          </w:tcPr>
+          <w:p>
+            <w:pPr>
+              <w:spacing w:line="360" w:lineRule="auto"/>
+              <w:jc w:val="center"/>
+              <w:rPr>
+                <w:b/>
+                <w:bCs/>
+                <w:szCs w:val="24"/>
+              </w:rPr>
+            </w:pPr>
+            <w:r>
+              <w:rPr>
+                <w:b/>
+                <w:bCs/>
+                <w:szCs w:val="24"/>
+              </w:rPr>
+              <w:t>Requisitos Não Funcional</w:t>
+            </w:r>
+          </w:p>
+        </w:tc>
+      </w:tr>
+      <w:tr>
+        <w:tc>
+          <w:tcPr>
+            <w:tcW w:w="2966" w:type="dxa"/>
+            <w:gridSpan w:val="3"/>
+          </w:tcPr>
+          <w:p>
+            <w:pPr>
+              <w:spacing w:line="360" w:lineRule="auto"/>
+              <w:jc w:val="center"/>
+              <w:rPr>
+                <w:b/>
+                <w:bCs/>
+                <w:szCs w:val="24"/>
+              </w:rPr>
+            </w:pPr>
+            <w:r>
+              <w:rPr>
+                <w:b/>
+                <w:bCs/>
+                <w:szCs w:val="24"/>
+              </w:rPr>
+              <w:t>Cód-Nome</w:t>
+            </w:r>
+          </w:p>
+        </w:tc>
+        <w:tc>
+          <w:tcPr>
+            <w:tcW w:w="3254" w:type="dxa"/>
+          </w:tcPr>
+          <w:p>
+            <w:pPr>
+              <w:spacing w:line="360" w:lineRule="auto"/>
+              <w:jc w:val="center"/>
+              <w:rPr>
+                <w:b/>
+                <w:bCs/>
+                <w:szCs w:val="24"/>
+              </w:rPr>
+            </w:pPr>
+            <w:r>
+              <w:rPr>
+                <w:b/>
+                <w:bCs/>
+                <w:szCs w:val="24"/>
+              </w:rPr>
+              <w:t>Descrição</w:t>
+            </w:r>
+          </w:p>
+        </w:tc>
+        <w:tc>
+          <w:tcPr>
+            <w:tcW w:w="2541" w:type="dxa"/>
+          </w:tcPr>
+          <w:p>
+            <w:pPr>
+              <w:spacing w:line="360" w:lineRule="auto"/>
+              <w:jc w:val="center"/>
+              <w:rPr>
+                <w:b/>
+                <w:bCs/>
+                <w:szCs w:val="24"/>
+              </w:rPr>
+            </w:pPr>
+            <w:r>
+              <w:rPr>
+                <w:b/>
+                <w:bCs/>
+                <w:szCs w:val="24"/>
+              </w:rPr>
+              <w:t>Categoria</w:t>
+            </w:r>
+          </w:p>
+        </w:tc>
+      </w:tr>
+      <w:tr>
+        <w:tc>
+          <w:tcPr>
+            <w:tcW w:w="2966" w:type="dxa"/>
+            <w:gridSpan w:val="3"/>
+          </w:tcPr>
+          <w:p>
+            <w:pPr>
+              <w:spacing w:line="360" w:lineRule="auto"/>
+              <w:rPr>
+                <w:szCs w:val="24"/>
+              </w:rPr>
+            </w:pPr>
+            <w:r>
+              <w:rPr>
+                <w:szCs w:val="24"/>
+              </w:rPr>
+              <w:t>NF1</w:t>
+            </w:r>
+            <w:r>
+              <w:rPr>
+                <w:szCs w:val="24"/>
+              </w:rPr>
+              <w:t>8</w:t>
+            </w:r>
+            <w:r>
+              <w:rPr>
+                <w:szCs w:val="24"/>
+              </w:rPr>
+              <w:t xml:space="preserve">.1 Validação </w:t>
+            </w:r>
+            <w:r>
+              <w:rPr>
+                <w:szCs w:val="24"/>
+              </w:rPr>
+              <w:t>por linha</w:t>
+            </w:r>
+          </w:p>
+        </w:tc>
+        <w:tc>
+          <w:tcPr>
+            <w:tcW w:w="3254" w:type="dxa"/>
+          </w:tcPr>
+          <w:p>
+            <w:pPr>
+              <w:spacing w:line="360" w:lineRule="auto"/>
+              <w:rPr>
+                <w:szCs w:val="24"/>
+              </w:rPr>
+            </w:pPr>
+            <w:r>
+              <w:t>O sistema deve validar cada linha da planilha (campos obrigatórios, categoria da NR-6 e unicidade CA+tamanho), importando apenas as válidas.</w:t>
+            </w:r>
+          </w:p>
+        </w:tc>
+        <w:tc>
+          <w:tcPr>
+            <w:tcW w:w="2541" w:type="dxa"/>
+          </w:tcPr>
+          <w:p>
+            <w:pPr>
+              <w:spacing w:line="360" w:lineRule="auto"/>
+              <w:rPr>
+                <w:szCs w:val="24"/>
+              </w:rPr>
+            </w:pPr>
+            <w:r>
+              <w:rPr>
+                <w:szCs w:val="24"/>
+              </w:rPr>
+              <w:t>Segurança</w:t>
+            </w:r>
+          </w:p>
+        </w:tc>
+      </w:tr>
+      <w:tr>
+        <w:tc>
+          <w:tcPr>
+            <w:tcW w:w="2966" w:type="dxa"/>
+            <w:gridSpan w:val="3"/>
+          </w:tcPr>
+          <w:p>
+            <w:pPr>
+              <w:spacing w:line="360" w:lineRule="auto"/>
+              <w:rPr>
+                <w:szCs w:val="24"/>
+              </w:rPr>
+            </w:pPr>
+            <w:r>
+              <w:rPr>
+                <w:szCs w:val="24"/>
+              </w:rPr>
+              <w:t>NF1</w:t>
+            </w:r>
+            <w:r>
+              <w:rPr>
+                <w:szCs w:val="24"/>
+              </w:rPr>
+              <w:t>8</w:t>
+            </w:r>
+            <w:r>
+              <w:rPr>
+                <w:szCs w:val="24"/>
+              </w:rPr>
+              <w:t xml:space="preserve">.2 </w:t>
+            </w:r>
+            <w:r>
+              <w:rPr>
+                <w:szCs w:val="24"/>
+              </w:rPr>
+              <w:t>Relatório de importação</w:t>
+            </w:r>
+          </w:p>
+        </w:tc>
+        <w:tc>
+          <w:tcPr>
+            <w:tcW w:w="3254" w:type="dxa"/>
+          </w:tcPr>
+          <w:p>
+            <w:pPr>
+              <w:spacing w:line="360" w:lineRule="auto"/>
+              <w:rPr>
+                <w:szCs w:val="24"/>
+              </w:rPr>
+            </w:pPr>
+            <w:r>
+              <w:t>O sistema deve informar quantas linhas foram importadas e listar os erros indicando o número da linha e o motivo.</w:t>
+            </w:r>
+          </w:p>
+        </w:tc>
+        <w:tc>
+          <w:tcPr>
+            <w:tcW w:w="2541" w:type="dxa"/>
+          </w:tcPr>
+          <w:p>
+            <w:pPr>
+              <w:spacing w:line="360" w:lineRule="auto"/>
+              <w:rPr>
+                <w:szCs w:val="24"/>
+              </w:rPr>
+            </w:pPr>
+            <w:r>
+              <w:rPr>
+                <w:szCs w:val="24"/>
+              </w:rPr>
+              <w:t>Usabilidade</w:t>
+            </w:r>
+          </w:p>
+        </w:tc>
+      </w:tr>
+      <w:tr>
+        <w:tc>
+          <w:tcPr>
+            <w:tcW w:w="2966" w:type="dxa"/>
+            <w:gridSpan w:val="3"/>
+          </w:tcPr>
+          <w:p>
+            <w:pPr>
+              <w:spacing w:line="360" w:lineRule="auto"/>
+              <w:rPr>
+                <w:szCs w:val="24"/>
+              </w:rPr>
+            </w:pPr>
+            <w:r>
+              <w:rPr>
+                <w:szCs w:val="24"/>
+              </w:rPr>
+              <w:t>NF1</w:t>
+            </w:r>
+            <w:r>
+              <w:rPr>
+                <w:szCs w:val="24"/>
+              </w:rPr>
+              <w:t>8</w:t>
+            </w:r>
+            <w:r>
+              <w:rPr>
+                <w:szCs w:val="24"/>
+              </w:rPr>
+              <w:t xml:space="preserve">.3 </w:t>
+            </w:r>
+            <w:r>
+              <w:rPr>
+                <w:szCs w:val="24"/>
+              </w:rPr>
+              <w:t>Modelo de planilha</w:t>
+            </w:r>
+          </w:p>
+        </w:tc>
+        <w:tc>
+          <w:tcPr>
+            <w:tcW w:w="3254" w:type="dxa"/>
+          </w:tcPr>
+          <w:p>
+            <w:pPr>
+              <w:spacing w:line="360" w:lineRule="auto"/>
+              <w:rPr>
+                <w:szCs w:val="24"/>
+              </w:rPr>
+            </w:pPr>
+            <w:r>
+              <w:t>O sistema deve disponibilizar um modelo de planilha (CSV) para download com as colunas esperadas.</w:t>
+            </w:r>
+          </w:p>
+        </w:tc>
+        <w:tc>
+          <w:tcPr>
+            <w:tcW w:w="2541" w:type="dxa"/>
+          </w:tcPr>
+          <w:p>
+            <w:pPr>
+              <w:spacing w:line="360" w:lineRule="auto"/>
+              <w:rPr>
+                <w:szCs w:val="24"/>
+              </w:rPr>
+            </w:pPr>
+            <w:r>
+              <w:rPr>
+                <w:szCs w:val="24"/>
+              </w:rPr>
+              <w:t>Usabilidade</w:t>
             </w:r>
           </w:p>
         </w:tc>

</xml_diff>